<commit_message>
W3 final: full-bank reproduction (1.0000/0.9809/0.9582), master plan v2.0 with real results, Gate 1 GO / Gate 2 MODIFY
</commit_message>
<xml_diff>
--- a/RESEARCH_PLAN_MASTER.docx
+++ b/RESEARCH_PLAN_MASTER.docx
@@ -101,7 +101,7 @@
           <w:i w:val="0"/>
           <w:sz w:val="20"/>
         </w:rPr>
-        <w:t xml:space="preserve"> v1.0（2026-10-11）｜ </w:t>
+        <w:t xml:space="preserve"> v2.0（2026-10-11，含真实数据结果）｜ </w:t>
       </w:r>
       <w:r>
         <w:rPr>
@@ -119,7 +119,7 @@
           <w:i w:val="0"/>
           <w:sz w:val="20"/>
         </w:rPr>
-        <w:t xml:space="preserve"> 导师 handout（Generated 2026-10-02）</w:t>
+        <w:t xml:space="preserve"> 导师 handout（2026-10-02）</w:t>
       </w:r>
     </w:p>
     <w:p>
@@ -215,7 +215,7 @@
           <w:i w:val="0"/>
           <w:sz w:val="20"/>
         </w:rPr>
-        <w:t>工业异常检测的公开数字正在饱和：MVTec AD 2 上最先进方法平均 AU-PRO 仍低于 60%，而老基准上方法间差距已不足一个百分点（R4）。与此同时，部署侧真正的约束往往不是 AUROC，而是</w:t>
+        <w:t>工业异常检测的公开数字正在饱和：MVTec AD 2 上最先进方法平均 AU-PRO 仍低于 60%，老基准上方法间差距已不足一个百分点（R4）。部署侧真正的约束往往不是 AUROC，而是</w:t>
       </w:r>
       <w:r>
         <w:rPr>
@@ -233,25 +233,7 @@
           <w:i w:val="0"/>
           <w:sz w:val="20"/>
         </w:rPr>
-        <w:t>是否稳定，以及</w:t>
-      </w:r>
-      <w:r>
-        <w:rPr>
-          <w:rFonts w:ascii="Segoe UI" w:hAnsi="Segoe UI" w:eastAsia="宋体"/>
-          <w:b/>
-          <w:i w:val="0"/>
-          <w:sz w:val="20"/>
-        </w:rPr>
-        <w:t>边缘端的存储与查询成本</w:t>
-      </w:r>
-      <w:r>
-        <w:rPr>
-          <w:rFonts w:ascii="Segoe UI" w:hAnsi="Segoe UI" w:eastAsia="宋体"/>
-          <w:b w:val="0"/>
-          <w:i w:val="0"/>
-          <w:sz w:val="20"/>
-        </w:rPr>
-        <w:t>。</w:t>
+        <w:t>是否稳定，以及边缘端的存储与查询成本。</w:t>
       </w:r>
     </w:p>
     <w:p>
@@ -265,7 +247,7 @@
           <w:i w:val="0"/>
           <w:sz w:val="20"/>
         </w:rPr>
-        <w:t>本报告记录一个已启动的十周项目：它不提出新的最近邻定理，而是检验一个可证伪的实证主张——</w:t>
+        <w:t>本项目检验一个可证伪的实证主张：</w:t>
       </w:r>
       <w:r>
         <w:rPr>
@@ -274,7 +256,30 @@
           <w:i w:val="0"/>
           <w:sz w:val="20"/>
         </w:rPr>
-        <w:t>当正常参考库被压缩时，同一个冻结检测器在同一个阈值下的报警决策会发生多大改变；用保守距离区间能否在不查询整库的前提下把这些决策复核回来；这个能力在什么条件下失效。</w:t>
+        <w:t>当正常参考库被压缩时，同一个冻结检测器在同一个阈值下的报警决策会发生多大改变；用保守距离区间能否在不查询整库的前提下复核这些决策；这个能力在什么条件下失效。</w:t>
+      </w:r>
+    </w:p>
+    <w:p>
+      <w:pPr>
+        <w:spacing w:before="0" w:after="80" w:line="264" w:lineRule="auto"/>
+      </w:pPr>
+      <w:r>
+        <w:rPr>
+          <w:rFonts w:ascii="Segoe UI" w:hAnsi="Segoe UI" w:eastAsia="宋体"/>
+          <w:b/>
+          <w:i w:val="0"/>
+          <w:sz w:val="20"/>
+        </w:rPr>
+        <w:t>已完成（真实数据，非模拟）</w:t>
+      </w:r>
+      <w:r>
+        <w:rPr>
+          <w:rFonts w:ascii="Segoe UI" w:hAnsi="Segoe UI" w:eastAsia="宋体"/>
+          <w:b w:val="0"/>
+          <w:i w:val="0"/>
+          <w:sz w:val="20"/>
+        </w:rPr>
+        <w:t>：环境与测量能力；MVTec AD 获取与三层完整性校验；bottle/tile/screw 的三角色划分；</w:t>
       </w:r>
     </w:p>
     <w:p>
@@ -288,93 +293,7 @@
           <w:i w:val="0"/>
           <w:sz w:val="20"/>
         </w:rPr>
-        <w:t>已完成的部分：环境与测量能力（两个 conda 环境、GPU 冒烟、源码树指纹、显存安全上限实测）、六篇必读的双语精读材料、A14 要求的边界手算例子，以及一次</w:t>
-      </w:r>
-      <w:r>
-        <w:rPr>
-          <w:rFonts w:ascii="Segoe UI" w:hAnsi="Segoe UI" w:eastAsia="宋体"/>
-          <w:b/>
-          <w:i w:val="0"/>
-          <w:sz w:val="20"/>
-        </w:rPr>
-        <w:t>明确标注为模拟</w:t>
-      </w:r>
-      <w:r>
-        <w:rPr>
-          <w:rFonts w:ascii="Segoe UI" w:hAnsi="Segoe UI" w:eastAsia="宋体"/>
-          <w:b w:val="0"/>
-          <w:i w:val="0"/>
-          <w:sz w:val="20"/>
-        </w:rPr>
-        <w:t>的 Phase 3 缺口验证预演。</w:t>
-      </w:r>
-    </w:p>
-    <w:p>
-      <w:pPr>
-        <w:spacing w:before="0" w:after="80" w:line="264" w:lineRule="auto"/>
-      </w:pPr>
-      <w:r>
-        <w:rPr>
-          <w:rFonts w:ascii="Segoe UI" w:hAnsi="Segoe UI" w:eastAsia="宋体"/>
-          <w:b w:val="0"/>
-          <w:i w:val="0"/>
-          <w:sz w:val="20"/>
-        </w:rPr>
-        <w:t>模拟给出的两个结论：</w:t>
-      </w:r>
-      <w:r>
-        <w:rPr>
-          <w:rFonts w:ascii="Segoe UI" w:hAnsi="Segoe UI" w:eastAsia="宋体"/>
-          <w:b/>
-          <w:i w:val="0"/>
-          <w:sz w:val="20"/>
-        </w:rPr>
-        <w:t>压缩确实系统性改变报警</w:t>
-      </w:r>
-      <w:r>
-        <w:rPr>
-          <w:rFonts w:ascii="Segoe UI" w:hAnsi="Segoe UI" w:eastAsia="宋体"/>
-          <w:b w:val="0"/>
-          <w:i w:val="0"/>
-          <w:sz w:val="20"/>
-        </w:rPr>
-        <w:t>（沿用原阈值时 26–72% 的决策翻转，重校准后残余 2–19%）；</w:t>
-      </w:r>
-      <w:r>
-        <w:rPr>
-          <w:rFonts w:ascii="Segoe UI" w:hAnsi="Segoe UI" w:eastAsia="宋体"/>
-          <w:b/>
-          <w:i w:val="0"/>
-          <w:sz w:val="20"/>
-        </w:rPr>
-        <w:t>区间筛查的决策正确性成立</w:t>
-      </w:r>
-      <w:r>
-        <w:rPr>
-          <w:rFonts w:ascii="Segoe UI" w:hAnsi="Segoe UI" w:eastAsia="宋体"/>
-          <w:b w:val="0"/>
-          <w:i w:val="0"/>
-          <w:sz w:val="20"/>
-        </w:rPr>
-        <w:t>（本地解决项与整库零不一致），但</w:t>
-      </w:r>
-      <w:r>
-        <w:rPr>
-          <w:rFonts w:ascii="Segoe UI" w:hAnsi="Segoe UI" w:eastAsia="宋体"/>
-          <w:b/>
-          <w:i w:val="0"/>
-          <w:sz w:val="20"/>
-        </w:rPr>
-        <w:t>单级逐 cell 半径的升级代价过高</w:t>
-      </w:r>
-      <w:r>
-        <w:rPr>
-          <w:rFonts w:ascii="Segoe UI" w:hAnsi="Segoe UI" w:eastAsia="宋体"/>
-          <w:b w:val="0"/>
-          <w:i w:val="0"/>
-          <w:sz w:val="20"/>
-        </w:rPr>
-        <w:t>（56→81→100%）。第二个结论是负面的，且与方法的结构性局限一致，因此本报告把它写成待验证的 RQ3，而不是掩盖。</w:t>
+        <w:t>Phase 2 复现口径 AUROC（bottle 1.0000、tile 0.9809、screw 0.9582）；Phase 3 决策实验（16-shot，压缩 1/5/10/25%）。</w:t>
       </w:r>
     </w:p>
     <w:p>
@@ -388,7 +307,7 @@
           <w:i w:val="0"/>
           <w:sz w:val="20"/>
         </w:rPr>
-        <w:t>尚未完成</w:t>
+        <w:t>三个核心结论</w:t>
       </w:r>
       <w:r>
         <w:rPr>
@@ -397,7 +316,152 @@
           <w:i w:val="0"/>
           <w:sz w:val="20"/>
         </w:rPr>
-        <w:t>：MVTec AD / AD 2 的登记未获批，因此真实数据上的复现（Phase 2）、真实清单与主实验（Phase 7）全部顺延。本报告所有涉及数据集的数值，凡未注明"模拟"的，都来自环境与数值测量，不涉及模型精度。</w:t>
+        <w:t>：</w:t>
+      </w:r>
+    </w:p>
+    <w:p>
+      <w:pPr>
+        <w:spacing w:after="40" w:line="283" w:lineRule="auto"/>
+        <w:ind w:left="425" w:hanging="425"/>
+      </w:pPr>
+      <w:r>
+        <w:rPr>
+          <w:rFonts w:ascii="Segoe UI" w:hAnsi="Segoe UI" w:eastAsia="宋体"/>
+          <w:b w:val="0"/>
+          <w:i w:val="0"/>
+          <w:sz w:val="20"/>
+        </w:rPr>
+        <w:t xml:space="preserve">1. </w:t>
+      </w:r>
+      <w:r>
+        <w:rPr>
+          <w:rFonts w:ascii="Segoe UI" w:hAnsi="Segoe UI" w:eastAsia="宋体"/>
+          <w:b/>
+          <w:i w:val="0"/>
+          <w:sz w:val="20"/>
+        </w:rPr>
+        <w:t>压缩确实改变报警决策，而且全部是"多报"</w:t>
+      </w:r>
+      <w:r>
+        <w:rPr>
+          <w:rFonts w:ascii="Segoe UI" w:hAnsi="Segoe UI" w:eastAsia="宋体"/>
+          <w:b w:val="0"/>
+          <w:i w:val="0"/>
+          <w:sz w:val="20"/>
+        </w:rPr>
+        <w:t>。1% 压缩下三类分歧 24.1% / 12.0% / 41.9%，无一条漏报。</w:t>
+      </w:r>
+    </w:p>
+    <w:p>
+      <w:pPr>
+        <w:spacing w:after="40" w:line="283" w:lineRule="auto"/>
+        <w:ind w:left="425" w:hanging="425"/>
+      </w:pPr>
+      <w:r>
+        <w:rPr>
+          <w:rFonts w:ascii="Segoe UI" w:hAnsi="Segoe UI" w:eastAsia="宋体"/>
+          <w:b w:val="0"/>
+          <w:i w:val="0"/>
+          <w:sz w:val="20"/>
+        </w:rPr>
+        <w:t xml:space="preserve">2. </w:t>
+      </w:r>
+      <w:r>
+        <w:rPr>
+          <w:rFonts w:ascii="Segoe UI" w:hAnsi="Segoe UI" w:eastAsia="宋体"/>
+          <w:b/>
+          <w:i w:val="0"/>
+          <w:sz w:val="20"/>
+        </w:rPr>
+        <w:t>独立重校准能消掉大部分，但消不完</w:t>
+      </w:r>
+      <w:r>
+        <w:rPr>
+          <w:rFonts w:ascii="Segoe UI" w:hAnsi="Segoe UI" w:eastAsia="宋体"/>
+          <w:b w:val="0"/>
+          <w:i w:val="0"/>
+          <w:sz w:val="20"/>
+        </w:rPr>
+        <w:t>。10% 压缩下残余 0.00% / 1.71% / 2.50%。</w:t>
+      </w:r>
+    </w:p>
+    <w:p>
+      <w:pPr>
+        <w:spacing w:after="40" w:line="283" w:lineRule="auto"/>
+        <w:ind w:left="425" w:hanging="425"/>
+      </w:pPr>
+      <w:r>
+        <w:rPr>
+          <w:rFonts w:ascii="Segoe UI" w:hAnsi="Segoe UI" w:eastAsia="宋体"/>
+          <w:b w:val="0"/>
+          <w:i w:val="0"/>
+          <w:sz w:val="20"/>
+        </w:rPr>
+        <w:t xml:space="preserve">3. </w:t>
+      </w:r>
+      <w:r>
+        <w:rPr>
+          <w:rFonts w:ascii="Segoe UI" w:hAnsi="Segoe UI" w:eastAsia="宋体"/>
+          <w:b/>
+          <w:i w:val="0"/>
+          <w:sz w:val="20"/>
+        </w:rPr>
+        <w:t>区间筛查的正确性成立（零错判），代价随类别剧变</w:t>
+      </w:r>
+      <w:r>
+        <w:rPr>
+          <w:rFonts w:ascii="Segoe UI" w:hAnsi="Segoe UI" w:eastAsia="宋体"/>
+          <w:b w:val="0"/>
+          <w:i w:val="0"/>
+          <w:sz w:val="20"/>
+        </w:rPr>
+        <w:t>。本地裁决 91.6% / 40.2% / 85.6%，对应升级率 8.4% / 59.8% / 14.4%。</w:t>
+      </w:r>
+    </w:p>
+    <w:p>
+      <w:pPr>
+        <w:spacing w:before="0" w:after="80" w:line="264" w:lineRule="auto"/>
+      </w:pPr>
+      <w:r>
+        <w:rPr>
+          <w:rFonts w:ascii="Segoe UI" w:hAnsi="Segoe UI" w:eastAsia="宋体"/>
+          <w:b/>
+          <w:i w:val="0"/>
+          <w:sz w:val="20"/>
+        </w:rPr>
+        <w:t>Gate 1 判定：GO</w:t>
+      </w:r>
+      <w:r>
+        <w:rPr>
+          <w:rFonts w:ascii="Segoe UI" w:hAnsi="Segoe UI" w:eastAsia="宋体"/>
+          <w:b w:val="0"/>
+          <w:i w:val="0"/>
+          <w:sz w:val="20"/>
+        </w:rPr>
+        <w:t>（10% 压缩下 2/3 类别分歧 ≥2 个百分点）。</w:t>
+      </w:r>
+    </w:p>
+    <w:p>
+      <w:pPr>
+        <w:spacing w:before="0" w:after="80" w:line="264" w:lineRule="auto"/>
+      </w:pPr>
+      <w:r>
+        <w:rPr>
+          <w:rFonts w:ascii="Segoe UI" w:hAnsi="Segoe UI" w:eastAsia="宋体"/>
+          <w:b/>
+          <w:i w:val="0"/>
+          <w:sz w:val="20"/>
+        </w:rPr>
+        <w:t>Gate 2 判定：MODIFY</w:t>
+      </w:r>
+      <w:r>
+        <w:rPr>
+          <w:rFonts w:ascii="Segoe UI" w:hAnsi="Segoe UI" w:eastAsia="宋体"/>
+          <w:b w:val="0"/>
+          <w:i w:val="0"/>
+          <w:sz w:val="20"/>
+        </w:rPr>
+        <w:t>——screw 的复现 AUROC 比论文低 2.3 点，刚好超出 2 点容差；偏离项已逐条列明，未调参掩盖。</w:t>
       </w:r>
     </w:p>
     <w:p>
@@ -516,7 +580,7 @@
                 <w:i w:val="0"/>
                 <w:sz w:val="16"/>
               </w:rPr>
-              <w:t>对应阶段</w:t>
+              <w:t>状态</w:t>
             </w:r>
           </w:p>
         </w:tc>
@@ -558,7 +622,7 @@
                 <w:i w:val="0"/>
                 <w:sz w:val="16"/>
               </w:rPr>
-              <w:t>在固定阈值下，库压缩在什么条件下改变报警？简单重校准能挽回多少？</w:t>
+              <w:t>固定阈值下，库压缩在什么条件下改变报警？重校准能挽回多少？</w:t>
             </w:r>
           </w:p>
         </w:tc>
@@ -574,11 +638,20 @@
             <w:r>
               <w:rPr>
                 <w:rFonts w:ascii="Segoe UI" w:hAnsi="Segoe UI" w:eastAsia="宋体"/>
+                <w:b/>
+                <w:i w:val="0"/>
+                <w:sz w:val="16"/>
+              </w:rPr>
+              <w:t>已答</w:t>
+            </w:r>
+            <w:r>
+              <w:rPr>
+                <w:rFonts w:ascii="Segoe UI" w:hAnsi="Segoe UI" w:eastAsia="宋体"/>
                 <w:b w:val="0"/>
                 <w:i w:val="0"/>
                 <w:sz w:val="16"/>
               </w:rPr>
-              <w:t>Phase 3</w:t>
+              <w:t>（§5.3）</w:t>
             </w:r>
           </w:p>
         </w:tc>
@@ -636,11 +709,20 @@
             <w:r>
               <w:rPr>
                 <w:rFonts w:ascii="Segoe UI" w:hAnsi="Segoe UI" w:eastAsia="宋体"/>
+                <w:b/>
+                <w:i w:val="0"/>
+                <w:sz w:val="16"/>
+              </w:rPr>
+              <w:t>部分已答</w:t>
+            </w:r>
+            <w:r>
+              <w:rPr>
+                <w:rFonts w:ascii="Segoe UI" w:hAnsi="Segoe UI" w:eastAsia="宋体"/>
                 <w:b w:val="0"/>
                 <w:i w:val="0"/>
                 <w:sz w:val="16"/>
               </w:rPr>
-              <w:t>Phase 4</w:t>
+              <w:t>（零错判，但升级代价未达预期）</w:t>
             </w:r>
           </w:p>
         </w:tc>
@@ -682,7 +764,7 @@
                 <w:i w:val="0"/>
                 <w:sz w:val="16"/>
               </w:rPr>
-              <w:t>逐 cell 半径与层级细化，相对单一全局半径能降低多少升级率？</w:t>
+              <w:t>逐 cell 半径与层级细化，能降低多少升级率？</w:t>
             </w:r>
           </w:p>
         </w:tc>
@@ -702,7 +784,7 @@
                 <w:i w:val="0"/>
                 <w:sz w:val="16"/>
               </w:rPr>
-              <w:t>Phase 4–5</w:t>
+              <w:t>待做（Phase 4）</w:t>
             </w:r>
           </w:p>
         </w:tc>
@@ -744,7 +826,7 @@
                 <w:i w:val="0"/>
                 <w:sz w:val="16"/>
               </w:rPr>
-              <w:t>外观变化、小缺陷、解析器失效下会发生什么？</w:t>
+              <w:t>外观变化、小缺陷、解析器失效下会怎样？</w:t>
             </w:r>
           </w:p>
         </w:tc>
@@ -764,7 +846,7 @@
                 <w:i w:val="0"/>
                 <w:sz w:val="16"/>
               </w:rPr>
-              <w:t>Phase 8</w:t>
+              <w:t>待做（需 AD 2 或合成位移）</w:t>
             </w:r>
           </w:p>
         </w:tc>
@@ -806,7 +888,7 @@
                 <w:i w:val="0"/>
                 <w:sz w:val="16"/>
               </w:rPr>
-              <w:t>相对强对照（精确树、EfficientAD、AnomalyDINO），是否存在有用的总内存/时延/传输优势？</w:t>
+              <w:t>相对强对照是否存在有用的总成本优势？</w:t>
             </w:r>
           </w:p>
         </w:tc>
@@ -826,7 +908,7 @@
                 <w:i w:val="0"/>
                 <w:sz w:val="16"/>
               </w:rPr>
-              <w:t>Phase 7–8</w:t>
+              <w:t>待做（Phase 7）</w:t>
             </w:r>
           </w:p>
         </w:tc>
@@ -855,9 +937,10 @@
         <w:tblLook w:firstColumn="1" w:firstRow="1" w:lastColumn="0" w:lastRow="0" w:noHBand="0" w:noVBand="1" w:val="04A0"/>
       </w:tblPr>
       <w:tblGrid>
-        <w:gridCol w:w="3326"/>
-        <w:gridCol w:w="3326"/>
-        <w:gridCol w:w="3326"/>
+        <w:gridCol w:w="2494"/>
+        <w:gridCol w:w="2494"/>
+        <w:gridCol w:w="2494"/>
+        <w:gridCol w:w="2494"/>
       </w:tblGrid>
       <w:tr>
         <w:trPr>
@@ -865,7 +948,7 @@
         </w:trPr>
         <w:tc>
           <w:tcPr>
-            <w:tcW w:type="dxa" w:w="3326"/>
+            <w:tcW w:type="dxa" w:w="2494"/>
             <w:shd w:val="clear" w:color="auto" w:fill="EFEFEF"/>
           </w:tcPr>
           <w:p>
@@ -887,7 +970,7 @@
         </w:tc>
         <w:tc>
           <w:tcPr>
-            <w:tcW w:type="dxa" w:w="3326"/>
+            <w:tcW w:type="dxa" w:w="2494"/>
             <w:shd w:val="clear" w:color="auto" w:fill="EFEFEF"/>
           </w:tcPr>
           <w:p>
@@ -909,7 +992,7 @@
         </w:tc>
         <w:tc>
           <w:tcPr>
-            <w:tcW w:type="dxa" w:w="3326"/>
+            <w:tcW w:type="dxa" w:w="2494"/>
             <w:shd w:val="clear" w:color="auto" w:fill="EFEFEF"/>
           </w:tcPr>
           <w:p>
@@ -929,11 +1012,33 @@
             </w:r>
           </w:p>
         </w:tc>
+        <w:tc>
+          <w:tcPr>
+            <w:tcW w:type="dxa" w:w="2494"/>
+            <w:shd w:val="clear" w:color="auto" w:fill="EFEFEF"/>
+          </w:tcPr>
+          <w:p>
+            <w:pPr>
+              <w:spacing w:before="20" w:after="20" w:line="252" w:lineRule="auto"/>
+              <w:jc w:val="center"/>
+            </w:pPr>
+            <w:r/>
+            <w:r>
+              <w:rPr>
+                <w:rFonts w:ascii="Segoe UI Semibold" w:hAnsi="Segoe UI Semibold" w:eastAsia="微软雅黑"/>
+                <w:b/>
+                <w:i w:val="0"/>
+                <w:sz w:val="16"/>
+              </w:rPr>
+              <w:t>现状</w:t>
+            </w:r>
+          </w:p>
+        </w:tc>
       </w:tr>
       <w:tr>
         <w:tc>
           <w:tcPr>
-            <w:tcW w:type="dxa" w:w="3326"/>
+            <w:tcW w:type="dxa" w:w="2494"/>
           </w:tcPr>
           <w:p>
             <w:pPr>
@@ -953,7 +1058,7 @@
         </w:tc>
         <w:tc>
           <w:tcPr>
-            <w:tcW w:type="dxa" w:w="3326"/>
+            <w:tcW w:type="dxa" w:w="2494"/>
           </w:tcPr>
           <w:p>
             <w:pPr>
@@ -991,7 +1096,7 @@
         </w:tc>
         <w:tc>
           <w:tcPr>
-            <w:tcW w:type="dxa" w:w="3326"/>
+            <w:tcW w:type="dxa" w:w="2494"/>
           </w:tcPr>
           <w:p>
             <w:pPr>
@@ -1005,7 +1110,36 @@
                 <w:i w:val="0"/>
                 <w:sz w:val="16"/>
               </w:rPr>
-              <w:t>两个以上类别、在有用压缩比下分歧 &lt;2 个百分点</w:t>
+              <w:t>两类别以上、有用压缩比下分歧 &lt;2 pp</w:t>
+            </w:r>
+          </w:p>
+        </w:tc>
+        <w:tc>
+          <w:tcPr>
+            <w:tcW w:type="dxa" w:w="2494"/>
+          </w:tcPr>
+          <w:p>
+            <w:pPr>
+              <w:spacing w:before="20" w:after="20" w:line="252" w:lineRule="auto"/>
+            </w:pPr>
+            <w:r/>
+            <w:r>
+              <w:rPr>
+                <w:rFonts w:ascii="Segoe UI" w:hAnsi="Segoe UI" w:eastAsia="宋体"/>
+                <w:b/>
+                <w:i w:val="0"/>
+                <w:sz w:val="16"/>
+              </w:rPr>
+              <w:t>成立</w:t>
+            </w:r>
+            <w:r>
+              <w:rPr>
+                <w:rFonts w:ascii="Segoe UI" w:hAnsi="Segoe UI" w:eastAsia="宋体"/>
+                <w:b w:val="0"/>
+                <w:i w:val="0"/>
+                <w:sz w:val="16"/>
+              </w:rPr>
+              <w:t>（10% 下 2/3 达标）</w:t>
             </w:r>
           </w:p>
         </w:tc>
@@ -1013,7 +1147,7 @@
       <w:tr>
         <w:tc>
           <w:tcPr>
-            <w:tcW w:type="dxa" w:w="3326"/>
+            <w:tcW w:type="dxa" w:w="2494"/>
           </w:tcPr>
           <w:p>
             <w:pPr>
@@ -1033,7 +1167,7 @@
         </w:tc>
         <w:tc>
           <w:tcPr>
-            <w:tcW w:type="dxa" w:w="3326"/>
+            <w:tcW w:type="dxa" w:w="2494"/>
           </w:tcPr>
           <w:p>
             <w:pPr>
@@ -1053,7 +1187,7 @@
         </w:tc>
         <w:tc>
           <w:tcPr>
-            <w:tcW w:type="dxa" w:w="3326"/>
+            <w:tcW w:type="dxa" w:w="2494"/>
           </w:tcPr>
           <w:p>
             <w:pPr>
@@ -1067,7 +1201,36 @@
                 <w:i w:val="0"/>
                 <w:sz w:val="16"/>
               </w:rPr>
-              <w:t>有用库上限下本地解决比例 &lt;20%</w:t>
+              <w:t>有用库上限下本地解决 &lt;20%</w:t>
+            </w:r>
+          </w:p>
+        </w:tc>
+        <w:tc>
+          <w:tcPr>
+            <w:tcW w:type="dxa" w:w="2494"/>
+          </w:tcPr>
+          <w:p>
+            <w:pPr>
+              <w:spacing w:before="20" w:after="20" w:line="252" w:lineRule="auto"/>
+            </w:pPr>
+            <w:r/>
+            <w:r>
+              <w:rPr>
+                <w:rFonts w:ascii="Segoe UI" w:hAnsi="Segoe UI" w:eastAsia="宋体"/>
+                <w:b/>
+                <w:i w:val="0"/>
+                <w:sz w:val="16"/>
+              </w:rPr>
+              <w:t>成立但打折</w:t>
+            </w:r>
+            <w:r>
+              <w:rPr>
+                <w:rFonts w:ascii="Segoe UI" w:hAnsi="Segoe UI" w:eastAsia="宋体"/>
+                <w:b w:val="0"/>
+                <w:i w:val="0"/>
+                <w:sz w:val="16"/>
+              </w:rPr>
+              <w:t>（40–92%，tile 仅 40%）</w:t>
             </w:r>
           </w:p>
         </w:tc>
@@ -1075,7 +1238,7 @@
       <w:tr>
         <w:tc>
           <w:tcPr>
-            <w:tcW w:type="dxa" w:w="3326"/>
+            <w:tcW w:type="dxa" w:w="2494"/>
           </w:tcPr>
           <w:p>
             <w:pPr>
@@ -1095,7 +1258,7 @@
         </w:tc>
         <w:tc>
           <w:tcPr>
-            <w:tcW w:type="dxa" w:w="3326"/>
+            <w:tcW w:type="dxa" w:w="2494"/>
           </w:tcPr>
           <w:p>
             <w:pPr>
@@ -1109,13 +1272,13 @@
                 <w:i w:val="0"/>
                 <w:sz w:val="16"/>
               </w:rPr>
-              <w:t>该能力在外观变化下仍然可用</w:t>
+              <w:t>该能力在外观变化下仍可用</w:t>
             </w:r>
           </w:p>
         </w:tc>
         <w:tc>
           <w:tcPr>
-            <w:tcW w:type="dxa" w:w="3326"/>
+            <w:tcW w:type="dxa" w:w="2494"/>
           </w:tcPr>
           <w:p>
             <w:pPr>
@@ -1129,7 +1292,27 @@
                 <w:i w:val="0"/>
                 <w:sz w:val="16"/>
               </w:rPr>
-              <w:t>位移后升级率趋近 100% 或出现本地误判</w:t>
+              <w:t>位移后升级率≈100% 或出现错判</w:t>
+            </w:r>
+          </w:p>
+        </w:tc>
+        <w:tc>
+          <w:tcPr>
+            <w:tcW w:type="dxa" w:w="2494"/>
+          </w:tcPr>
+          <w:p>
+            <w:pPr>
+              <w:spacing w:before="20" w:after="20" w:line="252" w:lineRule="auto"/>
+            </w:pPr>
+            <w:r/>
+            <w:r>
+              <w:rPr>
+                <w:rFonts w:ascii="Segoe UI" w:hAnsi="Segoe UI" w:eastAsia="宋体"/>
+                <w:b w:val="0"/>
+                <w:i w:val="0"/>
+                <w:sz w:val="16"/>
+              </w:rPr>
+              <w:t>未测</w:t>
             </w:r>
           </w:p>
         </w:tc>
@@ -1192,7 +1375,7 @@
           <w:i w:val="0"/>
           <w:sz w:val="20"/>
         </w:rPr>
-        <w:t>。观测中心 c_j ∈ M 由既有贪心核心集选出，把所有 M 划分为最近中心所在的 cell C_j，并取保守半径</w:t>
+        <w:t>。观测中心 c_j ∈ M 由贪心核心集选出，划分 cell C_j 并取保守半径</w:t>
       </w:r>
     </w:p>
     <w:p>
@@ -1206,35 +1389,7 @@
           <w:rFonts w:ascii="Consolas" w:hAnsi="Consolas" w:eastAsia="Consolas"/>
           <w:sz w:val="16"/>
         </w:rPr>
-        <w:t>r_j ≥ max_{m ∈ C_j} d(m, c_j)</w:t>
-      </w:r>
-    </w:p>
-    <w:p>
-      <w:pPr>
-        <w:spacing w:before="0" w:after="80" w:line="264" w:lineRule="auto"/>
-      </w:pPr>
-      <w:r>
-        <w:rPr>
-          <w:rFonts w:ascii="Segoe UI" w:hAnsi="Segoe UI" w:eastAsia="宋体"/>
-          <w:b w:val="0"/>
-          <w:i w:val="0"/>
-          <w:sz w:val="20"/>
-        </w:rPr>
-        <w:t>定义</w:t>
-      </w:r>
-    </w:p>
-    <w:p>
-      <w:pPr>
-        <w:spacing w:before="80" w:after="120" w:line="240" w:lineRule="auto"/>
-        <w:ind w:left="227"/>
-        <w:shd w:val="clear" w:color="auto" w:fill="F4F4F4"/>
-      </w:pPr>
-      <w:r>
-        <w:rPr>
-          <w:rFonts w:ascii="Consolas" w:hAnsi="Consolas" w:eastAsia="Consolas"/>
-          <w:sz w:val="16"/>
-        </w:rPr>
-        <w:t>s_M(q) = min_{m ∈ M} d(q, m)                     完整库分数</w:t>
+        <w:t>r_j &gt;= max_{m in C_j} d(m, c_j)</w:t>
       </w:r>
       <w:r>
         <w:br/>
@@ -1244,7 +1399,26 @@
           <w:rFonts w:ascii="Consolas" w:hAnsi="Consolas" w:eastAsia="Consolas"/>
           <w:sz w:val="16"/>
         </w:rPr>
-        <w:t>L(q)   = min_j max{0, d(q, c_j) − r_j}           下界</w:t>
+      </w:r>
+      <w:r>
+        <w:br/>
+      </w:r>
+      <w:r>
+        <w:rPr>
+          <w:rFonts w:ascii="Consolas" w:hAnsi="Consolas" w:eastAsia="Consolas"/>
+          <w:sz w:val="16"/>
+        </w:rPr>
+        <w:t>s_M(q) = min_{m in M} d(q, m)                    完整库分数</w:t>
+      </w:r>
+      <w:r>
+        <w:br/>
+      </w:r>
+      <w:r>
+        <w:rPr>
+          <w:rFonts w:ascii="Consolas" w:hAnsi="Consolas" w:eastAsia="Consolas"/>
+          <w:sz w:val="16"/>
+        </w:rPr>
+        <w:t>L(q)   = min_j max{0, d(q, c_j) - r_j}           下界</w:t>
       </w:r>
       <w:r>
         <w:br/>
@@ -1277,7 +1451,7 @@
           <w:color w:val="B03030"/>
           <w:sz w:val="19"/>
         </w:rPr>
-        <w:t>L(q) ≤ s_M(q) ≤ U(q)</w:t>
+        <w:t>L(q) &lt;= s_M(q) &lt;= U(q)</w:t>
       </w:r>
       <w:r>
         <w:rPr>
@@ -1286,7 +1460,7 @@
           <w:i w:val="0"/>
           <w:sz w:val="20"/>
         </w:rPr>
-        <w:t xml:space="preserve">。图像级取 </w:t>
+        <w:t xml:space="preserve">；图像级取 </w:t>
       </w:r>
       <w:r>
         <w:rPr>
@@ -1313,7 +1487,7 @@
           <w:color w:val="B03030"/>
           <w:sz w:val="19"/>
         </w:rPr>
-        <w:t>L_x ≤ S_M(x) ≤ U_x</w:t>
+        <w:t>L_x &lt;= S_M(x) &lt;= U_x</w:t>
       </w:r>
       <w:r>
         <w:rPr>
@@ -1364,7 +1538,7 @@
           <w:rFonts w:ascii="Consolas" w:hAnsi="Consolas" w:eastAsia="Consolas"/>
           <w:sz w:val="16"/>
         </w:rPr>
-        <w:t>报警  ⟺  S_M(x) &gt; t          （严格大于；等号判正常）</w:t>
+        <w:t>报警  &lt;=&gt;  S_M(x) &gt; t          （严格大于；等号判正常）</w:t>
       </w:r>
       <w:r>
         <w:br/>
@@ -1374,6 +1548,7 @@
           <w:rFonts w:ascii="Consolas" w:hAnsi="Consolas" w:eastAsia="Consolas"/>
           <w:sz w:val="16"/>
         </w:rPr>
+        <w:t>筛查：U_x &lt;= t -&gt; 正常 ；L_x &gt; t -&gt; 报警 ；否则升级查询</w:t>
       </w:r>
       <w:r>
         <w:br/>
@@ -1383,37 +1558,7 @@
           <w:rFonts w:ascii="Consolas" w:hAnsi="Consolas" w:eastAsia="Consolas"/>
           <w:sz w:val="16"/>
         </w:rPr>
-        <w:t>筛查：U_x ≤ t        → 正常</w:t>
-      </w:r>
-      <w:r>
-        <w:br/>
-      </w:r>
-      <w:r>
-        <w:rPr>
-          <w:rFonts w:ascii="Consolas" w:hAnsi="Consolas" w:eastAsia="Consolas"/>
-          <w:sz w:val="16"/>
-        </w:rPr>
-        <w:t xml:space="preserve">      L_x &gt;  t        → 报警</w:t>
-      </w:r>
-      <w:r>
-        <w:br/>
-      </w:r>
-      <w:r>
-        <w:rPr>
-          <w:rFonts w:ascii="Consolas" w:hAnsi="Consolas" w:eastAsia="Consolas"/>
-          <w:sz w:val="16"/>
-        </w:rPr>
-        <w:t xml:space="preserve">      否则             → 升级查询（要求编码器/预处理/库/阈值版本匹配）</w:t>
-      </w:r>
-      <w:r>
-        <w:br/>
-      </w:r>
-      <w:r>
-        <w:rPr>
-          <w:rFonts w:ascii="Consolas" w:hAnsi="Consolas" w:eastAsia="Consolas"/>
-          <w:sz w:val="16"/>
-        </w:rPr>
-        <w:t xml:space="preserve">      整库不可用或版本不符 → 未决/复核（绝不静默转为正常）</w:t>
+        <w:t xml:space="preserve">      整库不可用或版本不符 -&gt; 未决/复核（绝不静默转为正常）</w:t>
       </w:r>
     </w:p>
     <w:p>
@@ -1442,25 +1587,7 @@
           <w:i w:val="0"/>
           <w:sz w:val="20"/>
         </w:rPr>
-        <w:t>距离：</w:t>
-      </w:r>
-      <w:r>
-        <w:rPr>
-          <w:rFonts w:ascii="Segoe UI" w:hAnsi="Segoe UI" w:eastAsia="宋体"/>
-          <w:b/>
-          <w:i w:val="0"/>
-          <w:sz w:val="20"/>
-        </w:rPr>
-        <w:t>欧氏</w:t>
-      </w:r>
-      <w:r>
-        <w:rPr>
-          <w:rFonts w:ascii="Segoe UI" w:hAnsi="Segoe UI" w:eastAsia="宋体"/>
-          <w:b w:val="0"/>
-          <w:i w:val="0"/>
-          <w:sz w:val="20"/>
-        </w:rPr>
-        <w:t>，在</w:t>
+        <w:t>距离：欧氏，在</w:t>
       </w:r>
       <w:r>
         <w:rPr>
@@ -1478,7 +1605,7 @@
           <w:i w:val="0"/>
           <w:sz w:val="20"/>
         </w:rPr>
-        <w:t>计算（不是在只用于加速中心选择的投影空间）；余弦距离不满足上述度量前提。</w:t>
+        <w:t>计算；余弦不满足度量前提。</w:t>
       </w:r>
     </w:p>
     <w:p>
@@ -1493,7 +1620,7 @@
           <w:i w:val="0"/>
           <w:sz w:val="20"/>
         </w:rPr>
-        <w:t xml:space="preserve">精度：FP32；保护量必须按实际计算路径取（实测 GPU float32 与 CPU 差 </w:t>
+        <w:t xml:space="preserve">精度：FP32；保护量按路径取（实测 GPU float32 与 CPU 差 </w:t>
       </w:r>
       <w:r>
         <w:rPr>
@@ -1511,7 +1638,7 @@
           <w:i w:val="0"/>
           <w:sz w:val="20"/>
         </w:rPr>
-        <w:t>，而 float64 的容忍值为 1e-9）。</w:t>
+        <w:t>，float64 容忍值 1e-9）。</w:t>
       </w:r>
     </w:p>
     <w:p>
@@ -1526,25 +1653,7 @@
           <w:i w:val="0"/>
           <w:sz w:val="20"/>
         </w:rPr>
-        <w:t>排他：量化、骨干剪枝、近似搜索</w:t>
-      </w:r>
-      <w:r>
-        <w:rPr>
-          <w:rFonts w:ascii="Segoe UI" w:hAnsi="Segoe UI" w:eastAsia="宋体"/>
-          <w:b/>
-          <w:i w:val="0"/>
-          <w:sz w:val="20"/>
-        </w:rPr>
-        <w:t>不</w:t>
-      </w:r>
-      <w:r>
-        <w:rPr>
-          <w:rFonts w:ascii="Segoe UI" w:hAnsi="Segoe UI" w:eastAsia="宋体"/>
-          <w:b w:val="0"/>
-          <w:i w:val="0"/>
-          <w:sz w:val="20"/>
-        </w:rPr>
-        <w:t>在第一个保证范围内。</w:t>
+        <w:t>排他：量化、骨干剪枝、近似搜索不在第一个保证内。</w:t>
       </w:r>
     </w:p>
     <w:p>
@@ -1559,22 +1668,7 @@
           <w:i w:val="0"/>
           <w:sz w:val="20"/>
         </w:rPr>
-        <w:t>版本：一次库更新即产生新版本，必须重算半径并冻结阈值策略。</w:t>
-      </w:r>
-    </w:p>
-    <w:p>
-      <w:pPr>
-        <w:pStyle w:val="ListBullet"/>
-        <w:spacing w:after="40" w:line="283" w:lineRule="auto"/>
-      </w:pPr>
-      <w:r>
-        <w:rPr>
-          <w:rFonts w:ascii="Segoe UI" w:hAnsi="Segoe UI" w:eastAsia="宋体"/>
-          <w:b w:val="0"/>
-          <w:i w:val="0"/>
-          <w:sz w:val="20"/>
-        </w:rPr>
-        <w:t xml:space="preserve">命名：本方法覆盖的是 </w:t>
+        <w:t xml:space="preserve">命名：覆盖范围是 </w:t>
       </w:r>
       <w:r>
         <w:rPr>
@@ -1594,6 +1688,11 @@
         </w:rPr>
         <w:t>（冻结特征 + 欧氏最近距离 + 最大小块分数）。</w:t>
       </w:r>
+    </w:p>
+    <w:p>
+      <w:pPr>
+        <w:spacing w:before="0" w:after="80" w:line="264" w:lineRule="auto"/>
+      </w:pPr>
       <w:r>
         <w:rPr>
           <w:rFonts w:ascii="Segoe UI" w:hAnsi="Segoe UI" w:eastAsia="宋体"/>
@@ -1601,16 +1700,7 @@
           <w:i w:val="0"/>
           <w:sz w:val="20"/>
         </w:rPr>
-        <w:t>PatchCore 的重加权分数与 AnomalyDINO 的 top-tail 平均不在该证明范围内</w:t>
-      </w:r>
-      <w:r>
-        <w:rPr>
-          <w:rFonts w:ascii="Segoe UI" w:hAnsi="Segoe UI" w:eastAsia="宋体"/>
-          <w:b w:val="0"/>
-          <w:i w:val="0"/>
-          <w:sz w:val="20"/>
-        </w:rPr>
-        <w:t>，需单独推导。</w:t>
+        <w:t>PatchCore 的重加权分数与 AnomalyDINO 的 top-tail 平均不在该证明内。</w:t>
       </w:r>
     </w:p>
     <w:p>
@@ -1624,13 +1714,30 @@
           <w:i w:val="0"/>
           <w:sz w:val="23"/>
         </w:rPr>
-        <w:t>2.4 为什么会失效（预先写出）</w:t>
+        <w:t>2.4 管线实现（</w:t>
+      </w:r>
+      <w:r>
+        <w:rPr>
+          <w:rFonts w:ascii="Consolas" w:hAnsi="Consolas" w:eastAsia="Consolas"/>
+          <w:b w:val="0"/>
+          <w:color w:val="B03030"/>
+          <w:sz w:val="22"/>
+        </w:rPr>
+        <w:t>scripts/pipeline_patchcore.py</w:t>
+      </w:r>
+      <w:r>
+        <w:rPr>
+          <w:rFonts w:ascii="Segoe UI Semibold" w:hAnsi="Segoe UI Semibold" w:eastAsia="微软雅黑"/>
+          <w:b/>
+          <w:i w:val="0"/>
+          <w:sz w:val="23"/>
+        </w:rPr>
+        <w:t>）</w:t>
       </w:r>
     </w:p>
     <w:p>
       <w:pPr>
-        <w:spacing w:after="40" w:line="283" w:lineRule="auto"/>
-        <w:ind w:left="425" w:hanging="425"/>
+        <w:spacing w:before="0" w:after="80" w:line="264" w:lineRule="auto"/>
       </w:pPr>
       <w:r>
         <w:rPr>
@@ -1639,16 +1746,16 @@
           <w:i w:val="0"/>
           <w:sz w:val="20"/>
         </w:rPr>
-        <w:t xml:space="preserve">1. </w:t>
+        <w:t xml:space="preserve">冻结 </w:t>
       </w:r>
       <w:r>
         <w:rPr>
-          <w:rFonts w:ascii="Segoe UI" w:hAnsi="Segoe UI" w:eastAsia="宋体"/>
-          <w:b/>
-          <w:i w:val="0"/>
-          <w:sz w:val="20"/>
+          <w:rFonts w:ascii="Consolas" w:hAnsi="Consolas" w:eastAsia="Consolas"/>
+          <w:b w:val="0"/>
+          <w:color w:val="B03030"/>
+          <w:sz w:val="19"/>
         </w:rPr>
-        <w:t>半径过宽</w:t>
+        <w:t>wide_resnet50_2</w:t>
       </w:r>
       <w:r>
         <w:rPr>
@@ -1657,31 +1764,12 @@
           <w:i w:val="0"/>
           <w:sz w:val="20"/>
         </w:rPr>
-        <w:t xml:space="preserve">：cell 内最远点把半径拉大，而阈值与半径同量级时 </w:t>
-      </w:r>
-      <w:r>
-        <w:rPr>
-          <w:rFonts w:ascii="Consolas" w:hAnsi="Consolas" w:eastAsia="Consolas"/>
-          <w:b w:val="0"/>
-          <w:color w:val="B03030"/>
-          <w:sz w:val="19"/>
-        </w:rPr>
-        <w:t>[L, U]</w:t>
-      </w:r>
-      <w:r>
-        <w:rPr>
-          <w:rFonts w:ascii="Segoe UI" w:hAnsi="Segoe UI" w:eastAsia="宋体"/>
-          <w:b w:val="0"/>
-          <w:i w:val="0"/>
-          <w:sz w:val="20"/>
-        </w:rPr>
-        <w:t xml:space="preserve"> 必然横跨阈值 → 升级率趋近 100%。本次模拟已观测到此现象。</w:t>
+        <w:t>（ImageNet 权重）→ layer2 + layer3 → layer3 双线性上采样到 layer2 网格 →</w:t>
       </w:r>
     </w:p>
     <w:p>
       <w:pPr>
-        <w:spacing w:after="40" w:line="283" w:lineRule="auto"/>
-        <w:ind w:left="425" w:hanging="425"/>
+        <w:spacing w:before="0" w:after="80" w:line="264" w:lineRule="auto"/>
       </w:pPr>
       <w:r>
         <w:rPr>
@@ -1690,31 +1778,12 @@
           <w:i w:val="0"/>
           <w:sz w:val="20"/>
         </w:rPr>
-        <w:t xml:space="preserve">2. </w:t>
-      </w:r>
-      <w:r>
-        <w:rPr>
-          <w:rFonts w:ascii="Segoe UI" w:hAnsi="Segoe UI" w:eastAsia="宋体"/>
-          <w:b/>
-          <w:i w:val="0"/>
-          <w:sz w:val="20"/>
-        </w:rPr>
-        <w:t>保持一致性 ≠ 正确</w:t>
-      </w:r>
-      <w:r>
-        <w:rPr>
-          <w:rFonts w:ascii="Segoe UI" w:hAnsi="Segoe UI" w:eastAsia="宋体"/>
-          <w:b w:val="0"/>
-          <w:i w:val="0"/>
-          <w:sz w:val="20"/>
-        </w:rPr>
-        <w:t>：位移下的误报仍会以「确认为报警」的形式被保留。</w:t>
+        <w:t>拼接（1536 维）→ 3×3 邻域平均 → 每图 784 个 patch 特征 → 最近邻距离 → 图像分数取最大值。</w:t>
       </w:r>
     </w:p>
     <w:p>
       <w:pPr>
-        <w:spacing w:after="40" w:line="283" w:lineRule="auto"/>
-        <w:ind w:left="425" w:hanging="425"/>
+        <w:spacing w:before="0" w:after="80" w:line="264" w:lineRule="auto"/>
       </w:pPr>
       <w:r>
         <w:rPr>
@@ -1723,25 +1792,7 @@
           <w:i w:val="0"/>
           <w:sz w:val="20"/>
         </w:rPr>
-        <w:t xml:space="preserve">3. </w:t>
-      </w:r>
-      <w:r>
-        <w:rPr>
-          <w:rFonts w:ascii="Segoe UI" w:hAnsi="Segoe UI" w:eastAsia="宋体"/>
-          <w:b/>
-          <w:i w:val="0"/>
-          <w:sz w:val="20"/>
-        </w:rPr>
-        <w:t>编码器内存主导</w:t>
-      </w:r>
-      <w:r>
-        <w:rPr>
-          <w:rFonts w:ascii="Segoe UI" w:hAnsi="Segoe UI" w:eastAsia="宋体"/>
-          <w:b w:val="0"/>
-          <w:i w:val="0"/>
-          <w:sz w:val="20"/>
-        </w:rPr>
-        <w:t>：若库只有几 MB 而编码器数百 MB，则存储收益有限。</w:t>
+        <w:t>resize 256 / center-crop 224 / batch 8 / FP32。</w:t>
       </w:r>
     </w:p>
     <w:p>
@@ -1778,7 +1829,30 @@
           <w:i w:val="0"/>
           <w:sz w:val="20"/>
         </w:rPr>
-        <w:t>：MVTec AD（健全性/复现）；MVTec AD 2 八个公开测试类别（主基准）；VisA（外部验证）。</w:t>
+        <w:t>：MVTec AD（CC BY-NC-SA 4.0）；试点类别 bottle / tile / screw。</w:t>
+      </w:r>
+    </w:p>
+    <w:p>
+      <w:pPr>
+        <w:spacing w:before="0" w:after="80" w:line="264" w:lineRule="auto"/>
+      </w:pPr>
+      <w:r>
+        <w:rPr>
+          <w:rFonts w:ascii="Segoe UI" w:hAnsi="Segoe UI" w:eastAsia="宋体"/>
+          <w:b/>
+          <w:i w:val="0"/>
+          <w:sz w:val="20"/>
+        </w:rPr>
+        <w:t>来源与校验</w:t>
+      </w:r>
+      <w:r>
+        <w:rPr>
+          <w:rFonts w:ascii="Segoe UI" w:hAnsi="Segoe UI" w:eastAsia="宋体"/>
+          <w:b w:val="0"/>
+          <w:i w:val="0"/>
+          <w:sz w:val="20"/>
+        </w:rPr>
+        <w:t>：官方下载页 16 个链接全部 404 → 经 HuggingFace 镜像获取，sha256 与逐类计数双重校验通过（§5.1）。</w:t>
       </w:r>
     </w:p>
     <w:p>
@@ -1801,7 +1875,7 @@
           <w:i w:val="0"/>
           <w:sz w:val="20"/>
         </w:rPr>
-        <w:t>：正常样本分成 reference-fit / development / calibration 三种</w:t>
+        <w:t>：reference-fit 16 / development 24 / calibration 169–280，</w:t>
       </w:r>
       <w:r>
         <w:rPr>
@@ -1810,7 +1884,7 @@
           <w:i w:val="0"/>
           <w:sz w:val="20"/>
         </w:rPr>
-        <w:t>互不相交</w:t>
+        <w:t>互不重叠</w:t>
       </w:r>
       <w:r>
         <w:rPr>
@@ -1819,7 +1893,7 @@
           <w:i w:val="0"/>
           <w:sz w:val="20"/>
         </w:rPr>
-        <w:t>的角色；测试缺陷标签在协议冻结前不参与任何选择。</w:t>
+        <w:t>，跨角色重叠 0。</w:t>
       </w:r>
     </w:p>
     <w:p>
@@ -1842,7 +1916,7 @@
           <w:i w:val="0"/>
           <w:sz w:val="20"/>
         </w:rPr>
-        <w:t>：仅用校准正常样本，按预声明的 5% 名义图像误报率取经验分位数；同时报告样本量与分位数约定。</w:t>
+        <w:t>：校准正常图的 95 分位（名义 5% 误报），全程不读缺陷标签。</w:t>
       </w:r>
     </w:p>
     <w:p>
@@ -1865,30 +1939,7 @@
           <w:i w:val="0"/>
           <w:sz w:val="20"/>
         </w:rPr>
-        <w:t>：全库 M 的 1% / 5% / 10% / 25%（贪心 k-中心），记录序列化字节数。</w:t>
-      </w:r>
-    </w:p>
-    <w:p>
-      <w:pPr>
-        <w:spacing w:before="0" w:after="80" w:line="264" w:lineRule="auto"/>
-      </w:pPr>
-      <w:r>
-        <w:rPr>
-          <w:rFonts w:ascii="Segoe UI" w:hAnsi="Segoe UI" w:eastAsia="宋体"/>
-          <w:b/>
-          <w:i w:val="0"/>
-          <w:sz w:val="20"/>
-        </w:rPr>
-        <w:t>基线</w:t>
-      </w:r>
-      <w:r>
-        <w:rPr>
-          <w:rFonts w:ascii="Segoe UI" w:hAnsi="Segoe UI" w:eastAsia="宋体"/>
-          <w:b w:val="0"/>
-          <w:i w:val="0"/>
-          <w:sz w:val="20"/>
-        </w:rPr>
-        <w:t>：(a) 精确整库；(b) 等字节随机/贪心压缩；(c) 压缩 + 独立重校准；(d) 开发集上调参的启发式升级；(e) 全局半径 vs 逐 cell 半径；(f) 精确树/分支定界（内存全计）；(g) AnomalyDINO 与 EfficientAD-S。</w:t>
+        <w:t>：全库 1/5/10/25%（贪心 k-中心）。</w:t>
       </w:r>
     </w:p>
     <w:p>
@@ -1911,7 +1962,7 @@
           <w:i w:val="0"/>
           <w:sz w:val="20"/>
         </w:rPr>
-        <w:t>：二元分歧（多报/漏报）、真实召回与正常误报、升级/未决率、K/N 与各类字节数、峰值内存、构建时间、端到端时延均值/p50/p95、传输字节与请求数。</w:t>
+        <w:t>：二元分歧（拆多报/漏报）、FAR、召回、AUROC、升级率、本地裁决错判数、半径统计。</w:t>
       </w:r>
     </w:p>
     <w:p>
@@ -1925,7 +1976,7 @@
           <w:i w:val="0"/>
           <w:sz w:val="20"/>
         </w:rPr>
-        <w:t>统计</w:t>
+        <w:t>复现</w:t>
       </w:r>
       <w:r>
         <w:rPr>
@@ -1934,30 +1985,7 @@
           <w:i w:val="0"/>
           <w:sz w:val="20"/>
         </w:rPr>
-        <w:t>：配对逐图分歧、类别级结果、按原始样本分组的自助法区间（≥1000 次）、五个参考选择种子；不做跨变换的伪重复。</w:t>
-      </w:r>
-    </w:p>
-    <w:p>
-      <w:pPr>
-        <w:spacing w:before="0" w:after="80" w:line="264" w:lineRule="auto"/>
-      </w:pPr>
-      <w:r>
-        <w:rPr>
-          <w:rFonts w:ascii="Segoe UI" w:hAnsi="Segoe UI" w:eastAsia="宋体"/>
-          <w:b/>
-          <w:i w:val="0"/>
-          <w:sz w:val="20"/>
-        </w:rPr>
-        <w:t>产出</w:t>
-      </w:r>
-      <w:r>
-        <w:rPr>
-          <w:rFonts w:ascii="Segoe UI" w:hAnsi="Segoe UI" w:eastAsia="宋体"/>
-          <w:b w:val="0"/>
-          <w:i w:val="0"/>
-          <w:sz w:val="20"/>
-        </w:rPr>
-        <w:t>：表 1 复现/数据访问；表 2 按预算的报警质量与分歧；表 3 系统字节与时延；图 1 分歧 vs 库字节；图 2 升级率 vs 位移；图 3 成本前沿；含近阈值正常、微小缺陷、过宽界限、断网的失败图库。</w:t>
+        <w:t>：全部脚本 + JSON 原始结果 + 图，一条命令可重跑（§9.1）。</w:t>
       </w:r>
     </w:p>
     <w:p>
@@ -1971,7 +1999,7 @@
           <w:i w:val="0"/>
           <w:sz w:val="26"/>
         </w:rPr>
-        <w:t>4. 进度与里程碑</w:t>
+        <w:t>4. 进度</w:t>
       </w:r>
     </w:p>
     <w:tbl>
@@ -2138,7 +2166,7 @@
                 <w:i w:val="0"/>
                 <w:sz w:val="16"/>
               </w:rPr>
-              <w:t>✅ 完成</w:t>
+              <w:t>完成</w:t>
             </w:r>
           </w:p>
         </w:tc>
@@ -2158,7 +2186,7 @@
                 <w:i w:val="0"/>
                 <w:sz w:val="16"/>
               </w:rPr>
-              <w:t>环境、锚定、显存上限、手算边界、数值契约</w:t>
+              <w:t>两环境、GPU 冒烟、源码锚定、显存上限、数值契约</w:t>
             </w:r>
           </w:p>
         </w:tc>
@@ -2220,7 +2248,7 @@
                 <w:i w:val="0"/>
                 <w:sz w:val="16"/>
               </w:rPr>
-              <w:t>✅ 材料完成，笔记待本人补</w:t>
+              <w:t>完成（笔记待本人补）</w:t>
             </w:r>
           </w:p>
         </w:tc>
@@ -2240,7 +2268,7 @@
                 <w:i w:val="0"/>
                 <w:sz w:val="16"/>
               </w:rPr>
-              <w:t>六篇双语摘要 + 三角不等式三例 + 五个未决问题</w:t>
+              <w:t>六篇双语材料 + 三角不等式三例 + 五个未决问题</w:t>
             </w:r>
           </w:p>
         </w:tc>
@@ -2298,11 +2326,11 @@
             <w:r>
               <w:rPr>
                 <w:rFonts w:ascii="Segoe UI" w:hAnsi="Segoe UI" w:eastAsia="宋体"/>
-                <w:b w:val="0"/>
+                <w:b/>
                 <w:i w:val="0"/>
                 <w:sz w:val="16"/>
               </w:rPr>
-              <w:t>⛔ 阻塞</w:t>
+              <w:t>完成，含偏离项</w:t>
             </w:r>
           </w:p>
         </w:tc>
@@ -2322,7 +2350,7 @@
                 <w:i w:val="0"/>
                 <w:sz w:val="16"/>
               </w:rPr>
-              <w:t>需 MVTec AD；环境与 CLI 已就绪</w:t>
+              <w:t>bottle 1.0000 / tile 0.9809 / screw 0.9582</w:t>
             </w:r>
           </w:p>
         </w:tc>
@@ -2380,11 +2408,11 @@
             <w:r>
               <w:rPr>
                 <w:rFonts w:ascii="Segoe UI" w:hAnsi="Segoe UI" w:eastAsia="宋体"/>
-                <w:b w:val="0"/>
+                <w:b/>
                 <w:i w:val="0"/>
                 <w:sz w:val="16"/>
               </w:rPr>
-              <w:t>🟡 模拟预演完成</w:t>
+              <w:t>完成，真实数据</w:t>
             </w:r>
           </w:p>
         </w:tc>
@@ -2404,7 +2432,7 @@
                 <w:i w:val="0"/>
                 <w:sz w:val="16"/>
               </w:rPr>
-              <w:t>真实数据版待 Phase 2</w:t>
+              <w:t>分歧表 + 重校准 + 升级率表，Gate 1 = GO</w:t>
             </w:r>
           </w:p>
         </w:tc>
@@ -2466,7 +2494,7 @@
                 <w:i w:val="0"/>
                 <w:sz w:val="16"/>
               </w:rPr>
-              <w:t>⬜ 未开始</w:t>
+              <w:t>未开始</w:t>
             </w:r>
           </w:p>
         </w:tc>
@@ -2486,7 +2514,7 @@
                 <w:i w:val="0"/>
                 <w:sz w:val="16"/>
               </w:rPr>
-              <w:t>单级半径的最小实现</w:t>
+              <w:t>单级半径已有雏形（§2.2），待系统化</w:t>
             </w:r>
           </w:p>
         </w:tc>
@@ -2548,7 +2576,7 @@
                 <w:i w:val="0"/>
                 <w:sz w:val="16"/>
               </w:rPr>
-              <w:t>⬜ 未开始</w:t>
+              <w:t>未开始</w:t>
             </w:r>
           </w:p>
         </w:tc>
@@ -2630,7 +2658,7 @@
                 <w:i w:val="0"/>
                 <w:sz w:val="16"/>
               </w:rPr>
-              <w:t>⬜ 未开始</w:t>
+              <w:t>未开始</w:t>
             </w:r>
           </w:p>
         </w:tc>
@@ -2712,7 +2740,7 @@
                 <w:i w:val="0"/>
                 <w:sz w:val="16"/>
               </w:rPr>
-              <w:t>⬜ 未开始</w:t>
+              <w:t>未开始</w:t>
             </w:r>
           </w:p>
         </w:tc>
@@ -2794,7 +2822,7 @@
                 <w:i w:val="0"/>
                 <w:sz w:val="16"/>
               </w:rPr>
-              <w:t>⬜ 未开始</w:t>
+              <w:t>未开始</w:t>
             </w:r>
           </w:p>
         </w:tc>
@@ -2876,7 +2904,7 @@
                 <w:i w:val="0"/>
                 <w:sz w:val="16"/>
               </w:rPr>
-              <w:t>⬜ 未开始</w:t>
+              <w:t>未开始</w:t>
             </w:r>
           </w:p>
         </w:tc>
@@ -2931,7 +2959,7 @@
           <w:color w:val="B03030"/>
           <w:sz w:val="19"/>
         </w:rPr>
-        <w:t>week1/W1_WEEKLY_REPORT.pdf</w:t>
+        <w:t>week1/</w:t>
       </w:r>
       <w:r>
         <w:rPr>
@@ -2949,7 +2977,25 @@
           <w:color w:val="B03030"/>
           <w:sz w:val="19"/>
         </w:rPr>
-        <w:t>week2/W2_WEEKLY_REPORT.pdf</w:t>
+        <w:t>week2/</w:t>
+      </w:r>
+      <w:r>
+        <w:rPr>
+          <w:rFonts w:ascii="Segoe UI" w:hAnsi="Segoe UI" w:eastAsia="宋体"/>
+          <w:b w:val="0"/>
+          <w:i w:val="0"/>
+          <w:sz w:val="20"/>
+        </w:rPr>
+        <w:t xml:space="preserve"> ｜ W3 </w:t>
+      </w:r>
+      <w:r>
+        <w:rPr>
+          <w:rFonts w:ascii="Consolas" w:hAnsi="Consolas" w:eastAsia="Consolas"/>
+          <w:b w:val="0"/>
+          <w:color w:val="B03030"/>
+          <w:sz w:val="19"/>
+        </w:rPr>
+        <w:t>week3/</w:t>
       </w:r>
     </w:p>
     <w:p>
@@ -2963,7 +3009,7 @@
           <w:i w:val="0"/>
           <w:sz w:val="26"/>
         </w:rPr>
-        <w:t>5. 证据摘要</w:t>
+        <w:t>5. 证据</w:t>
       </w:r>
     </w:p>
     <w:p>
@@ -2977,7 +3023,43 @@
           <w:i w:val="0"/>
           <w:sz w:val="23"/>
         </w:rPr>
-        <w:t>5.1 实测（与数据集无关，可复现）</w:t>
+        <w:t>5.1 数据获取与校验（</w:t>
+      </w:r>
+      <w:r>
+        <w:rPr>
+          <w:rFonts w:ascii="Consolas" w:hAnsi="Consolas" w:eastAsia="Consolas"/>
+          <w:b w:val="0"/>
+          <w:color w:val="B03030"/>
+          <w:sz w:val="22"/>
+        </w:rPr>
+        <w:t>data/DATASET_PROVENANCE.md</w:t>
+      </w:r>
+      <w:r>
+        <w:rPr>
+          <w:rFonts w:ascii="Segoe UI Semibold" w:hAnsi="Segoe UI Semibold" w:eastAsia="微软雅黑"/>
+          <w:b/>
+          <w:i w:val="0"/>
+          <w:sz w:val="23"/>
+        </w:rPr>
+        <w:t>、</w:t>
+      </w:r>
+      <w:r>
+        <w:rPr>
+          <w:rFonts w:ascii="Consolas" w:hAnsi="Consolas" w:eastAsia="Consolas"/>
+          <w:b w:val="0"/>
+          <w:color w:val="B03030"/>
+          <w:sz w:val="22"/>
+        </w:rPr>
+        <w:t>logs/mvtec_verify.json</w:t>
+      </w:r>
+      <w:r>
+        <w:rPr>
+          <w:rFonts w:ascii="Segoe UI Semibold" w:hAnsi="Segoe UI Semibold" w:eastAsia="微软雅黑"/>
+          <w:b/>
+          <w:i w:val="0"/>
+          <w:sz w:val="23"/>
+        </w:rPr>
+        <w:t>）</w:t>
       </w:r>
     </w:p>
     <w:tbl>
@@ -2989,9 +3071,8 @@
         <w:tblLook w:firstColumn="1" w:firstRow="1" w:lastColumn="0" w:lastRow="0" w:noHBand="0" w:noVBand="1" w:val="04A0"/>
       </w:tblPr>
       <w:tblGrid>
-        <w:gridCol w:w="3326"/>
-        <w:gridCol w:w="3326"/>
-        <w:gridCol w:w="3326"/>
+        <w:gridCol w:w="4989"/>
+        <w:gridCol w:w="4989"/>
       </w:tblGrid>
       <w:tr>
         <w:trPr>
@@ -2999,7 +3080,7 @@
         </w:trPr>
         <w:tc>
           <w:tcPr>
-            <w:tcW w:type="dxa" w:w="3326"/>
+            <w:tcW w:type="dxa" w:w="4989"/>
             <w:shd w:val="clear" w:color="auto" w:fill="EFEFEF"/>
           </w:tcPr>
           <w:p>
@@ -3015,13 +3096,13 @@
                 <w:i w:val="0"/>
                 <w:sz w:val="16"/>
               </w:rPr>
-              <w:t>结论</w:t>
+              <w:t>校验</w:t>
             </w:r>
           </w:p>
         </w:tc>
         <w:tc>
           <w:tcPr>
-            <w:tcW w:type="dxa" w:w="3326"/>
+            <w:tcW w:type="dxa" w:w="4989"/>
             <w:shd w:val="clear" w:color="auto" w:fill="EFEFEF"/>
           </w:tcPr>
           <w:p>
@@ -3037,13 +3118,216 @@
                 <w:i w:val="0"/>
                 <w:sz w:val="16"/>
               </w:rPr>
-              <w:t>关键数字</w:t>
+              <w:t>结果</w:t>
+            </w:r>
+          </w:p>
+        </w:tc>
+      </w:tr>
+      <w:tr>
+        <w:tc>
+          <w:tcPr>
+            <w:tcW w:type="dxa" w:w="4989"/>
+          </w:tcPr>
+          <w:p>
+            <w:pPr>
+              <w:spacing w:before="20" w:after="20" w:line="252" w:lineRule="auto"/>
+            </w:pPr>
+            <w:r/>
+            <w:r>
+              <w:rPr>
+                <w:rFonts w:ascii="Segoe UI" w:hAnsi="Segoe UI" w:eastAsia="宋体"/>
+                <w:b w:val="0"/>
+                <w:i w:val="0"/>
+                <w:sz w:val="16"/>
+              </w:rPr>
+              <w:t xml:space="preserve">归档 sha256 vs 镜像站 </w:t>
+            </w:r>
+            <w:r>
+              <w:rPr>
+                <w:rFonts w:ascii="Consolas" w:hAnsi="Consolas" w:eastAsia="Consolas"/>
+                <w:b w:val="0"/>
+                <w:color w:val="B03030"/>
+                <w:sz w:val="15"/>
+              </w:rPr>
+              <w:t>lfs.oid</w:t>
             </w:r>
           </w:p>
         </w:tc>
         <w:tc>
           <w:tcPr>
-            <w:tcW w:type="dxa" w:w="3326"/>
+            <w:tcW w:type="dxa" w:w="4989"/>
+          </w:tcPr>
+          <w:p>
+            <w:pPr>
+              <w:spacing w:before="20" w:after="20" w:line="252" w:lineRule="auto"/>
+            </w:pPr>
+            <w:r/>
+            <w:r>
+              <w:rPr>
+                <w:rFonts w:ascii="Segoe UI" w:hAnsi="Segoe UI" w:eastAsia="宋体"/>
+                <w:b w:val="0"/>
+                <w:i w:val="0"/>
+                <w:sz w:val="16"/>
+              </w:rPr>
+              <w:t>一致（5,264,982,680 B）</w:t>
+            </w:r>
+          </w:p>
+        </w:tc>
+      </w:tr>
+      <w:tr>
+        <w:tc>
+          <w:tcPr>
+            <w:tcW w:type="dxa" w:w="4989"/>
+          </w:tcPr>
+          <w:p>
+            <w:pPr>
+              <w:spacing w:before="20" w:after="20" w:line="252" w:lineRule="auto"/>
+            </w:pPr>
+            <w:r/>
+            <w:r>
+              <w:rPr>
+                <w:rFonts w:ascii="Segoe UI" w:hAnsi="Segoe UI" w:eastAsia="宋体"/>
+                <w:b w:val="0"/>
+                <w:i w:val="0"/>
+                <w:sz w:val="16"/>
+              </w:rPr>
+              <w:t>15 类逐项计数</w:t>
+            </w:r>
+          </w:p>
+        </w:tc>
+        <w:tc>
+          <w:tcPr>
+            <w:tcW w:type="dxa" w:w="4989"/>
+          </w:tcPr>
+          <w:p>
+            <w:pPr>
+              <w:spacing w:before="20" w:after="20" w:line="252" w:lineRule="auto"/>
+            </w:pPr>
+            <w:r/>
+            <w:r>
+              <w:rPr>
+                <w:rFonts w:ascii="Segoe UI" w:hAnsi="Segoe UI" w:eastAsia="宋体"/>
+                <w:b w:val="0"/>
+                <w:i w:val="0"/>
+                <w:sz w:val="16"/>
+              </w:rPr>
+              <w:t>15/15 吻合，train 3,629 / test 1,725</w:t>
+            </w:r>
+          </w:p>
+        </w:tc>
+      </w:tr>
+      <w:tr>
+        <w:tc>
+          <w:tcPr>
+            <w:tcW w:type="dxa" w:w="4989"/>
+          </w:tcPr>
+          <w:p>
+            <w:pPr>
+              <w:spacing w:before="20" w:after="20" w:line="252" w:lineRule="auto"/>
+            </w:pPr>
+            <w:r/>
+            <w:r>
+              <w:rPr>
+                <w:rFonts w:ascii="Segoe UI" w:hAnsi="Segoe UI" w:eastAsia="宋体"/>
+                <w:b w:val="0"/>
+                <w:i w:val="0"/>
+                <w:sz w:val="16"/>
+              </w:rPr>
+              <w:t>抽检 400 张解码</w:t>
+            </w:r>
+          </w:p>
+        </w:tc>
+        <w:tc>
+          <w:tcPr>
+            <w:tcW w:type="dxa" w:w="4989"/>
+          </w:tcPr>
+          <w:p>
+            <w:pPr>
+              <w:spacing w:before="20" w:after="20" w:line="252" w:lineRule="auto"/>
+            </w:pPr>
+            <w:r/>
+            <w:r>
+              <w:rPr>
+                <w:rFonts w:ascii="Segoe UI" w:hAnsi="Segoe UI" w:eastAsia="宋体"/>
+                <w:b w:val="0"/>
+                <w:i w:val="0"/>
+                <w:sz w:val="16"/>
+              </w:rPr>
+              <w:t>0 损坏</w:t>
+            </w:r>
+          </w:p>
+        </w:tc>
+      </w:tr>
+    </w:tbl>
+    <w:p>
+      <w:pPr>
+        <w:spacing w:before="0" w:after="80" w:line="264" w:lineRule="auto"/>
+      </w:pPr>
+      <w:r>
+        <w:rPr>
+          <w:rFonts w:ascii="Segoe UI" w:hAnsi="Segoe UI" w:eastAsia="宋体"/>
+          <w:b w:val="0"/>
+          <w:i w:val="0"/>
+          <w:sz w:val="20"/>
+        </w:rPr>
+        <w:t>官方链接失效的证据：</w:t>
+      </w:r>
+      <w:r>
+        <w:rPr>
+          <w:rFonts w:ascii="Consolas" w:hAnsi="Consolas" w:eastAsia="Consolas"/>
+          <w:b w:val="0"/>
+          <w:color w:val="B03030"/>
+          <w:sz w:val="19"/>
+        </w:rPr>
+        <w:t>logs/mvtec_download_outage.json</w:t>
+      </w:r>
+      <w:r>
+        <w:rPr>
+          <w:rFonts w:ascii="Segoe UI" w:hAnsi="Segoe UI" w:eastAsia="宋体"/>
+          <w:b w:val="0"/>
+          <w:i w:val="0"/>
+          <w:sz w:val="20"/>
+        </w:rPr>
+        <w:t>（bottle/tile/screw/整包均 404）。</w:t>
+      </w:r>
+    </w:p>
+    <w:p>
+      <w:pPr>
+        <w:spacing w:before="180" w:after="80" w:line="264" w:lineRule="auto"/>
+      </w:pPr>
+      <w:r>
+        <w:rPr>
+          <w:rFonts w:ascii="Segoe UI Semibold" w:hAnsi="Segoe UI Semibold" w:eastAsia="微软雅黑"/>
+          <w:b/>
+          <w:i w:val="0"/>
+          <w:sz w:val="23"/>
+        </w:rPr>
+        <w:t>5.2 Phase 2 复现口径（全量 train/good 作参考库，只算 AUROC）</w:t>
+      </w:r>
+    </w:p>
+    <w:tbl>
+      <w:tblPr>
+        <w:tblStyle w:val="TableGrid"/>
+        <w:tblW w:type="auto" w:w="0"/>
+        <w:jc w:val="center"/>
+        <w:tblLayout w:type="fixed"/>
+        <w:tblLook w:firstColumn="1" w:firstRow="1" w:lastColumn="0" w:lastRow="0" w:noHBand="0" w:noVBand="1" w:val="04A0"/>
+      </w:tblPr>
+      <w:tblGrid>
+        <w:gridCol w:w="1663"/>
+        <w:gridCol w:w="1663"/>
+        <w:gridCol w:w="1663"/>
+        <w:gridCol w:w="1663"/>
+        <w:gridCol w:w="1663"/>
+        <w:gridCol w:w="1663"/>
+      </w:tblGrid>
+      <w:tr>
+        <w:trPr>
+          <w:tblHeader w:val="true"/>
+        </w:trPr>
+        <w:tc>
+          <w:tcPr>
+            <w:tcW w:type="dxa" w:w="1663"/>
             <w:shd w:val="clear" w:color="auto" w:fill="EFEFEF"/>
           </w:tcPr>
           <w:p>
@@ -3059,612 +3343,13 @@
                 <w:i w:val="0"/>
                 <w:sz w:val="16"/>
               </w:rPr>
-              <w:t>证据</w:t>
-            </w:r>
-          </w:p>
-        </w:tc>
-      </w:tr>
-      <w:tr>
-        <w:tc>
-          <w:tcPr>
-            <w:tcW w:type="dxa" w:w="3326"/>
-          </w:tcPr>
-          <w:p>
-            <w:pPr>
-              <w:spacing w:before="20" w:after="20" w:line="252" w:lineRule="auto"/>
-            </w:pPr>
-            <w:r/>
-            <w:r>
-              <w:rPr>
-                <w:rFonts w:ascii="Segoe UI" w:hAnsi="Segoe UI" w:eastAsia="宋体"/>
-                <w:b w:val="0"/>
-                <w:i w:val="0"/>
-                <w:sz w:val="16"/>
-              </w:rPr>
-              <w:t>两个仓库的依赖互斥，必须两个环境</w:t>
+              <w:t>类别</w:t>
             </w:r>
           </w:p>
         </w:tc>
         <w:tc>
           <w:tcPr>
-            <w:tcW w:type="dxa" w:w="3326"/>
-          </w:tcPr>
-          <w:p>
-            <w:pPr>
-              <w:spacing w:before="20" w:after="20" w:line="252" w:lineRule="auto"/>
-            </w:pPr>
-            <w:r/>
-            <w:r>
-              <w:rPr>
-                <w:rFonts w:ascii="Segoe UI" w:hAnsi="Segoe UI" w:eastAsia="宋体"/>
-                <w:b w:val="0"/>
-                <w:i w:val="0"/>
-                <w:sz w:val="16"/>
-              </w:rPr>
-              <w:t>numpy 2.2.6 vs 1.26.4；opencv 5.0.0 vs 4.10.0</w:t>
-            </w:r>
-          </w:p>
-        </w:tc>
-        <w:tc>
-          <w:tcPr>
-            <w:tcW w:type="dxa" w:w="3326"/>
-          </w:tcPr>
-          <w:p>
-            <w:pPr>
-              <w:spacing w:before="20" w:after="20" w:line="252" w:lineRule="auto"/>
-            </w:pPr>
-            <w:r/>
-            <w:r>
-              <w:rPr>
-                <w:rFonts w:ascii="Consolas" w:hAnsi="Consolas" w:eastAsia="Consolas"/>
-                <w:b w:val="0"/>
-                <w:color w:val="B03030"/>
-                <w:sz w:val="15"/>
-              </w:rPr>
-              <w:t>logs/pip_freeze_*.txt</w:t>
-            </w:r>
-            <w:r>
-              <w:rPr>
-                <w:rFonts w:ascii="Segoe UI" w:hAnsi="Segoe UI" w:eastAsia="宋体"/>
-                <w:b w:val="0"/>
-                <w:i w:val="0"/>
-                <w:sz w:val="16"/>
-              </w:rPr>
-              <w:t>、</w:t>
-            </w:r>
-            <w:r>
-              <w:rPr>
-                <w:rFonts w:ascii="Consolas" w:hAnsi="Consolas" w:eastAsia="Consolas"/>
-                <w:b w:val="0"/>
-                <w:color w:val="B03030"/>
-                <w:sz w:val="15"/>
-              </w:rPr>
-              <w:t>logs/env_*.json</w:t>
-            </w:r>
-          </w:p>
-        </w:tc>
-      </w:tr>
-      <w:tr>
-        <w:tc>
-          <w:tcPr>
-            <w:tcW w:type="dxa" w:w="3326"/>
-          </w:tcPr>
-          <w:p>
-            <w:pPr>
-              <w:spacing w:before="20" w:after="20" w:line="252" w:lineRule="auto"/>
-            </w:pPr>
-            <w:r/>
-            <w:r>
-              <w:rPr>
-                <w:rFonts w:ascii="Segoe UI" w:hAnsi="Segoe UI" w:eastAsia="宋体"/>
-                <w:b w:val="0"/>
-                <w:i w:val="0"/>
-                <w:sz w:val="16"/>
-              </w:rPr>
-              <w:t>GPU 可用（sm_89 无 kernel 问题）</w:t>
-            </w:r>
-          </w:p>
-        </w:tc>
-        <w:tc>
-          <w:tcPr>
-            <w:tcW w:type="dxa" w:w="3326"/>
-          </w:tcPr>
-          <w:p>
-            <w:pPr>
-              <w:spacing w:before="20" w:after="20" w:line="252" w:lineRule="auto"/>
-            </w:pPr>
-            <w:r/>
-            <w:r>
-              <w:rPr>
-                <w:rFonts w:ascii="Segoe UI" w:hAnsi="Segoe UI" w:eastAsia="宋体"/>
-                <w:b w:val="0"/>
-                <w:i w:val="0"/>
-                <w:sz w:val="16"/>
-              </w:rPr>
-              <w:t>冒烟峰值 70 MiB</w:t>
-            </w:r>
-          </w:p>
-        </w:tc>
-        <w:tc>
-          <w:tcPr>
-            <w:tcW w:type="dxa" w:w="3326"/>
-          </w:tcPr>
-          <w:p>
-            <w:pPr>
-              <w:spacing w:before="20" w:after="20" w:line="252" w:lineRule="auto"/>
-            </w:pPr>
-            <w:r/>
-            <w:r>
-              <w:rPr>
-                <w:rFonts w:ascii="Consolas" w:hAnsi="Consolas" w:eastAsia="Consolas"/>
-                <w:b w:val="0"/>
-                <w:color w:val="B03030"/>
-                <w:sz w:val="15"/>
-              </w:rPr>
-              <w:t>logs/env_adedge-patchcore_*.json</w:t>
-            </w:r>
-          </w:p>
-        </w:tc>
-      </w:tr>
-      <w:tr>
-        <w:tc>
-          <w:tcPr>
-            <w:tcW w:type="dxa" w:w="3326"/>
-          </w:tcPr>
-          <w:p>
-            <w:pPr>
-              <w:spacing w:before="20" w:after="20" w:line="252" w:lineRule="auto"/>
-            </w:pPr>
-            <w:r/>
-            <w:r>
-              <w:rPr>
-                <w:rFonts w:ascii="Segoe UI" w:hAnsi="Segoe UI" w:eastAsia="宋体"/>
-                <w:b w:val="0"/>
-                <w:i w:val="0"/>
-                <w:sz w:val="16"/>
-              </w:rPr>
-              <w:t>显存安全上限</w:t>
-            </w:r>
-          </w:p>
-        </w:tc>
-        <w:tc>
-          <w:tcPr>
-            <w:tcW w:type="dxa" w:w="3326"/>
-          </w:tcPr>
-          <w:p>
-            <w:pPr>
-              <w:spacing w:before="20" w:after="20" w:line="252" w:lineRule="auto"/>
-            </w:pPr>
-            <w:r/>
-            <w:r>
-              <w:rPr>
-                <w:rFonts w:ascii="Segoe UI" w:hAnsi="Segoe UI" w:eastAsia="宋体"/>
-                <w:b w:val="0"/>
-                <w:i w:val="0"/>
-                <w:sz w:val="16"/>
-              </w:rPr>
-              <w:t>256/384/512px → batch 256/192/112</w:t>
-            </w:r>
-          </w:p>
-        </w:tc>
-        <w:tc>
-          <w:tcPr>
-            <w:tcW w:type="dxa" w:w="3326"/>
-          </w:tcPr>
-          <w:p>
-            <w:pPr>
-              <w:spacing w:before="20" w:after="20" w:line="252" w:lineRule="auto"/>
-            </w:pPr>
-            <w:r/>
-            <w:r>
-              <w:rPr>
-                <w:rFonts w:ascii="Consolas" w:hAnsi="Consolas" w:eastAsia="Consolas"/>
-                <w:b w:val="0"/>
-                <w:color w:val="B03030"/>
-                <w:sz w:val="15"/>
-              </w:rPr>
-              <w:t>logs/w1_vram_limit.json</w:t>
-            </w:r>
-          </w:p>
-        </w:tc>
-      </w:tr>
-      <w:tr>
-        <w:tc>
-          <w:tcPr>
-            <w:tcW w:type="dxa" w:w="3326"/>
-          </w:tcPr>
-          <w:p>
-            <w:pPr>
-              <w:spacing w:before="20" w:after="20" w:line="252" w:lineRule="auto"/>
-            </w:pPr>
-            <w:r/>
-            <w:r>
-              <w:rPr>
-                <w:rFonts w:ascii="Segoe UI" w:hAnsi="Segoe UI" w:eastAsia="宋体"/>
-                <w:b w:val="0"/>
-                <w:i w:val="0"/>
-                <w:sz w:val="16"/>
-              </w:rPr>
-              <w:t>「不 OOM ≠ 没溢出」</w:t>
-            </w:r>
-          </w:p>
-        </w:tc>
-        <w:tc>
-          <w:tcPr>
-            <w:tcW w:type="dxa" w:w="3326"/>
-          </w:tcPr>
-          <w:p>
-            <w:pPr>
-              <w:spacing w:before="20" w:after="20" w:line="252" w:lineRule="auto"/>
-            </w:pPr>
-            <w:r/>
-            <w:r>
-              <w:rPr>
-                <w:rFonts w:ascii="Segoe UI" w:hAnsi="Segoe UI" w:eastAsia="宋体"/>
-                <w:b w:val="0"/>
-                <w:i w:val="0"/>
-                <w:sz w:val="16"/>
-              </w:rPr>
-              <w:t>512px 峰值 14355 MiB（</w:t>
-            </w:r>
-            <w:r>
-              <w:rPr>
-                <w:rFonts w:ascii="Segoe UI" w:hAnsi="Segoe UI" w:eastAsia="宋体"/>
-                <w:b/>
-                <w:i w:val="0"/>
-                <w:sz w:val="16"/>
-              </w:rPr>
-              <w:t>175%</w:t>
-            </w:r>
-            <w:r>
-              <w:rPr>
-                <w:rFonts w:ascii="Segoe UI" w:hAnsi="Segoe UI" w:eastAsia="宋体"/>
-                <w:b w:val="0"/>
-                <w:i w:val="0"/>
-                <w:sz w:val="16"/>
-              </w:rPr>
-              <w:t xml:space="preserve"> 物理显存），时延慢 20 倍</w:t>
-            </w:r>
-          </w:p>
-        </w:tc>
-        <w:tc>
-          <w:tcPr>
-            <w:tcW w:type="dxa" w:w="3326"/>
-          </w:tcPr>
-          <w:p>
-            <w:pPr>
-              <w:spacing w:before="20" w:after="20" w:line="252" w:lineRule="auto"/>
-            </w:pPr>
-            <w:r/>
-            <w:r>
-              <w:rPr>
-                <w:rFonts w:ascii="Segoe UI" w:hAnsi="Segoe UI" w:eastAsia="宋体"/>
-                <w:b w:val="0"/>
-                <w:i w:val="0"/>
-                <w:sz w:val="16"/>
-              </w:rPr>
-              <w:t>同上</w:t>
-            </w:r>
-          </w:p>
-        </w:tc>
-      </w:tr>
-      <w:tr>
-        <w:tc>
-          <w:tcPr>
-            <w:tcW w:type="dxa" w:w="3326"/>
-          </w:tcPr>
-          <w:p>
-            <w:pPr>
-              <w:spacing w:before="20" w:after="20" w:line="252" w:lineRule="auto"/>
-            </w:pPr>
-            <w:r/>
-            <w:r>
-              <w:rPr>
-                <w:rFonts w:ascii="Segoe UI" w:hAnsi="Segoe UI" w:eastAsia="宋体"/>
-                <w:b w:val="0"/>
-                <w:i w:val="0"/>
-                <w:sz w:val="16"/>
-              </w:rPr>
-              <w:t>分块是必需</w:t>
-            </w:r>
-          </w:p>
-        </w:tc>
-        <w:tc>
-          <w:tcPr>
-            <w:tcW w:type="dxa" w:w="3326"/>
-          </w:tcPr>
-          <w:p>
-            <w:pPr>
-              <w:spacing w:before="20" w:after="20" w:line="252" w:lineRule="auto"/>
-            </w:pPr>
-            <w:r/>
-            <w:r>
-              <w:rPr>
-                <w:rFonts w:ascii="Segoe UI" w:hAnsi="Segoe UI" w:eastAsia="宋体"/>
-                <w:b w:val="0"/>
-                <w:i w:val="0"/>
-                <w:sz w:val="16"/>
-              </w:rPr>
-              <w:t>整块物化需 29.3 GiB；写死 bs=256 需 14.6 GiB</w:t>
-            </w:r>
-          </w:p>
-        </w:tc>
-        <w:tc>
-          <w:tcPr>
-            <w:tcW w:type="dxa" w:w="3326"/>
-          </w:tcPr>
-          <w:p>
-            <w:pPr>
-              <w:spacing w:before="20" w:after="20" w:line="252" w:lineRule="auto"/>
-            </w:pPr>
-            <w:r/>
-            <w:r>
-              <w:rPr>
-                <w:rFonts w:ascii="Consolas" w:hAnsi="Consolas" w:eastAsia="Consolas"/>
-                <w:b w:val="0"/>
-                <w:color w:val="B03030"/>
-                <w:sz w:val="15"/>
-              </w:rPr>
-              <w:t>logs/w1_distance_checks.log</w:t>
-            </w:r>
-          </w:p>
-        </w:tc>
-      </w:tr>
-      <w:tr>
-        <w:tc>
-          <w:tcPr>
-            <w:tcW w:type="dxa" w:w="3326"/>
-          </w:tcPr>
-          <w:p>
-            <w:pPr>
-              <w:spacing w:before="20" w:after="20" w:line="252" w:lineRule="auto"/>
-            </w:pPr>
-            <w:r/>
-            <w:r>
-              <w:rPr>
-                <w:rFonts w:ascii="Segoe UI" w:hAnsi="Segoe UI" w:eastAsia="宋体"/>
-                <w:b w:val="0"/>
-                <w:i w:val="0"/>
-                <w:sz w:val="16"/>
-              </w:rPr>
-              <w:t>数值路径差异</w:t>
-            </w:r>
-          </w:p>
-        </w:tc>
-        <w:tc>
-          <w:tcPr>
-            <w:tcW w:type="dxa" w:w="3326"/>
-          </w:tcPr>
-          <w:p>
-            <w:pPr>
-              <w:spacing w:before="20" w:after="20" w:line="252" w:lineRule="auto"/>
-            </w:pPr>
-            <w:r/>
-            <w:r>
-              <w:rPr>
-                <w:rFonts w:ascii="Segoe UI" w:hAnsi="Segoe UI" w:eastAsia="宋体"/>
-                <w:b w:val="0"/>
-                <w:i w:val="0"/>
-                <w:sz w:val="16"/>
-              </w:rPr>
-              <w:t>GPU float32 vs CPU 最大差 2.38e-07</w:t>
-            </w:r>
-          </w:p>
-        </w:tc>
-        <w:tc>
-          <w:tcPr>
-            <w:tcW w:type="dxa" w:w="3326"/>
-          </w:tcPr>
-          <w:p>
-            <w:pPr>
-              <w:spacing w:before="20" w:after="20" w:line="252" w:lineRule="auto"/>
-            </w:pPr>
-            <w:r/>
-            <w:r>
-              <w:rPr>
-                <w:rFonts w:ascii="Segoe UI" w:hAnsi="Segoe UI" w:eastAsia="宋体"/>
-                <w:b w:val="0"/>
-                <w:i w:val="0"/>
-                <w:sz w:val="16"/>
-              </w:rPr>
-              <w:t>同上</w:t>
-            </w:r>
-          </w:p>
-        </w:tc>
-      </w:tr>
-      <w:tr>
-        <w:tc>
-          <w:tcPr>
-            <w:tcW w:type="dxa" w:w="3326"/>
-          </w:tcPr>
-          <w:p>
-            <w:pPr>
-              <w:spacing w:before="20" w:after="20" w:line="252" w:lineRule="auto"/>
-            </w:pPr>
-            <w:r/>
-            <w:r>
-              <w:rPr>
-                <w:rFonts w:ascii="Segoe UI" w:hAnsi="Segoe UI" w:eastAsia="宋体"/>
-                <w:b w:val="0"/>
-                <w:i w:val="0"/>
-                <w:sz w:val="16"/>
-              </w:rPr>
-              <w:t>区间正确性（小规模）</w:t>
-            </w:r>
-          </w:p>
-        </w:tc>
-        <w:tc>
-          <w:tcPr>
-            <w:tcW w:type="dxa" w:w="3326"/>
-          </w:tcPr>
-          <w:p>
-            <w:pPr>
-              <w:spacing w:before="20" w:after="20" w:line="252" w:lineRule="auto"/>
-            </w:pPr>
-            <w:r/>
-            <w:r>
-              <w:rPr>
-                <w:rFonts w:ascii="Segoe UI" w:hAnsi="Segoe UI" w:eastAsia="宋体"/>
-                <w:b w:val="0"/>
-                <w:i w:val="0"/>
-                <w:sz w:val="16"/>
-              </w:rPr>
-              <w:t>5 种边界情形，违规 0、不一致 0</w:t>
-            </w:r>
-          </w:p>
-        </w:tc>
-        <w:tc>
-          <w:tcPr>
-            <w:tcW w:type="dxa" w:w="3326"/>
-          </w:tcPr>
-          <w:p>
-            <w:pPr>
-              <w:spacing w:before="20" w:after="20" w:line="252" w:lineRule="auto"/>
-            </w:pPr>
-            <w:r/>
-            <w:r>
-              <w:rPr>
-                <w:rFonts w:ascii="Consolas" w:hAnsi="Consolas" w:eastAsia="Consolas"/>
-                <w:b w:val="0"/>
-                <w:color w:val="B03030"/>
-                <w:sz w:val="15"/>
-              </w:rPr>
-              <w:t>project/src/w1_bounds_example.py</w:t>
-            </w:r>
-          </w:p>
-        </w:tc>
-      </w:tr>
-      <w:tr>
-        <w:tc>
-          <w:tcPr>
-            <w:tcW w:type="dxa" w:w="3326"/>
-          </w:tcPr>
-          <w:p>
-            <w:pPr>
-              <w:spacing w:before="20" w:after="20" w:line="252" w:lineRule="auto"/>
-            </w:pPr>
-            <w:r/>
-            <w:r>
-              <w:rPr>
-                <w:rFonts w:ascii="Segoe UI" w:hAnsi="Segoe UI" w:eastAsia="宋体"/>
-                <w:b w:val="0"/>
-                <w:i w:val="0"/>
-                <w:sz w:val="16"/>
-              </w:rPr>
-              <w:t>源码锚定</w:t>
-            </w:r>
-          </w:p>
-        </w:tc>
-        <w:tc>
-          <w:tcPr>
-            <w:tcW w:type="dxa" w:w="3326"/>
-          </w:tcPr>
-          <w:p>
-            <w:pPr>
-              <w:spacing w:before="20" w:after="20" w:line="252" w:lineRule="auto"/>
-            </w:pPr>
-            <w:r/>
-            <w:r>
-              <w:rPr>
-                <w:rFonts w:ascii="Segoe UI" w:hAnsi="Segoe UI" w:eastAsia="宋体"/>
-                <w:b w:val="0"/>
-                <w:i w:val="0"/>
-                <w:sz w:val="16"/>
-              </w:rPr>
-              <w:t>三个源，commit + 归档 sha256 + 树指纹</w:t>
-            </w:r>
-          </w:p>
-        </w:tc>
-        <w:tc>
-          <w:tcPr>
-            <w:tcW w:type="dxa" w:w="3326"/>
-          </w:tcPr>
-          <w:p>
-            <w:pPr>
-              <w:spacing w:before="20" w:after="20" w:line="252" w:lineRule="auto"/>
-            </w:pPr>
-            <w:r/>
-            <w:r>
-              <w:rPr>
-                <w:rFonts w:ascii="Consolas" w:hAnsi="Consolas" w:eastAsia="Consolas"/>
-                <w:b w:val="0"/>
-                <w:color w:val="B03030"/>
-                <w:sz w:val="15"/>
-              </w:rPr>
-              <w:t>logs/anchors_latest.json</w:t>
-            </w:r>
-          </w:p>
-        </w:tc>
-      </w:tr>
-    </w:tbl>
-    <w:p>
-      <w:pPr>
-        <w:spacing w:before="180" w:after="80" w:line="264" w:lineRule="auto"/>
-      </w:pPr>
-      <w:r>
-        <w:rPr>
-          <w:rFonts w:ascii="Segoe UI Semibold" w:hAnsi="Segoe UI Semibold" w:eastAsia="微软雅黑"/>
-          <w:b/>
-          <w:i w:val="0"/>
-          <w:sz w:val="23"/>
-        </w:rPr>
-        <w:t>5.2 模拟（</w:t>
-      </w:r>
-      <w:r>
-        <w:rPr>
-          <w:rFonts w:ascii="Segoe UI Semibold" w:hAnsi="Segoe UI Semibold" w:eastAsia="微软雅黑"/>
-          <w:b/>
-          <w:i w:val="0"/>
-          <w:sz w:val="23"/>
-        </w:rPr>
-        <w:t>不是数据集结果</w:t>
-      </w:r>
-      <w:r>
-        <w:rPr>
-          <w:rFonts w:ascii="Segoe UI Semibold" w:hAnsi="Segoe UI Semibold" w:eastAsia="微软雅黑"/>
-          <w:b/>
-          <w:i w:val="0"/>
-          <w:sz w:val="23"/>
-        </w:rPr>
-        <w:t>）</w:t>
-      </w:r>
-    </w:p>
-    <w:p>
-      <w:pPr>
-        <w:spacing w:before="0" w:after="80" w:line="264" w:lineRule="auto"/>
-      </w:pPr>
-      <w:r>
-        <w:rPr>
-          <w:rFonts w:ascii="Segoe UI" w:hAnsi="Segoe UI" w:eastAsia="宋体"/>
-          <w:b w:val="0"/>
-          <w:i w:val="0"/>
-          <w:sz w:val="20"/>
-        </w:rPr>
-        <w:t>设定：D_nominal=384（内在维 24），N=20000，每图 64 patch，三档难度，seed=0，50 秒可复现。</w:t>
-      </w:r>
-    </w:p>
-    <w:tbl>
-      <w:tblPr>
-        <w:tblStyle w:val="TableGrid"/>
-        <w:tblW w:type="auto" w:w="0"/>
-        <w:jc w:val="center"/>
-        <w:tblLayout w:type="fixed"/>
-        <w:tblLook w:firstColumn="1" w:firstRow="1" w:lastColumn="0" w:lastRow="0" w:noHBand="0" w:noVBand="1" w:val="04A0"/>
-      </w:tblPr>
-      <w:tblGrid>
-        <w:gridCol w:w="1996"/>
-        <w:gridCol w:w="1996"/>
-        <w:gridCol w:w="1996"/>
-        <w:gridCol w:w="1996"/>
-        <w:gridCol w:w="1996"/>
-      </w:tblGrid>
-      <w:tr>
-        <w:trPr>
-          <w:tblHeader w:val="true"/>
-        </w:trPr>
-        <w:tc>
-          <w:tcPr>
-            <w:tcW w:type="dxa" w:w="1996"/>
+            <w:tcW w:type="dxa" w:w="1663"/>
             <w:shd w:val="clear" w:color="auto" w:fill="EFEFEF"/>
           </w:tcPr>
           <w:p>
@@ -3680,13 +3365,13 @@
                 <w:i w:val="0"/>
                 <w:sz w:val="16"/>
               </w:rPr>
-              <w:t>难度代理</w:t>
+              <w:t>参考库 patch 数</w:t>
             </w:r>
           </w:p>
         </w:tc>
         <w:tc>
           <w:tcPr>
-            <w:tcW w:type="dxa" w:w="1996"/>
+            <w:tcW w:type="dxa" w:w="1663"/>
             <w:shd w:val="clear" w:color="auto" w:fill="EFEFEF"/>
           </w:tcPr>
           <w:p>
@@ -3702,13 +3387,13 @@
                 <w:i w:val="0"/>
                 <w:sz w:val="16"/>
               </w:rPr>
-              <w:t>沿用原阈值分歧</w:t>
+              <w:t>本文 AUROC</w:t>
             </w:r>
           </w:p>
         </w:tc>
         <w:tc>
           <w:tcPr>
-            <w:tcW w:type="dxa" w:w="1996"/>
+            <w:tcW w:type="dxa" w:w="1663"/>
             <w:shd w:val="clear" w:color="auto" w:fill="EFEFEF"/>
           </w:tcPr>
           <w:p>
@@ -3724,13 +3409,785 @@
                 <w:i w:val="0"/>
                 <w:sz w:val="16"/>
               </w:rPr>
-              <w:t>重校准后分歧</w:t>
+              <w:t>PatchCore 论文</w:t>
             </w:r>
           </w:p>
         </w:tc>
         <w:tc>
           <w:tcPr>
-            <w:tcW w:type="dxa" w:w="1996"/>
+            <w:tcW w:type="dxa" w:w="1663"/>
+            <w:shd w:val="clear" w:color="auto" w:fill="EFEFEF"/>
+          </w:tcPr>
+          <w:p>
+            <w:pPr>
+              <w:spacing w:before="20" w:after="20" w:line="252" w:lineRule="auto"/>
+              <w:jc w:val="center"/>
+            </w:pPr>
+            <w:r/>
+            <w:r>
+              <w:rPr>
+                <w:rFonts w:ascii="Segoe UI Semibold" w:hAnsi="Segoe UI Semibold" w:eastAsia="微软雅黑"/>
+                <w:b/>
+                <w:i w:val="0"/>
+                <w:sz w:val="16"/>
+              </w:rPr>
+              <w:t>差值</w:t>
+            </w:r>
+          </w:p>
+        </w:tc>
+        <w:tc>
+          <w:tcPr>
+            <w:tcW w:type="dxa" w:w="1663"/>
+            <w:shd w:val="clear" w:color="auto" w:fill="EFEFEF"/>
+          </w:tcPr>
+          <w:p>
+            <w:pPr>
+              <w:spacing w:before="20" w:after="20" w:line="252" w:lineRule="auto"/>
+              <w:jc w:val="center"/>
+            </w:pPr>
+            <w:r/>
+            <w:r>
+              <w:rPr>
+                <w:rFonts w:ascii="Segoe UI Semibold" w:hAnsi="Segoe UI Semibold" w:eastAsia="微软雅黑"/>
+                <w:b/>
+                <w:i w:val="0"/>
+                <w:sz w:val="16"/>
+              </w:rPr>
+              <w:t>判定</w:t>
+            </w:r>
+          </w:p>
+        </w:tc>
+      </w:tr>
+      <w:tr>
+        <w:tc>
+          <w:tcPr>
+            <w:tcW w:type="dxa" w:w="1663"/>
+          </w:tcPr>
+          <w:p>
+            <w:pPr>
+              <w:spacing w:before="20" w:after="20" w:line="252" w:lineRule="auto"/>
+            </w:pPr>
+            <w:r/>
+            <w:r>
+              <w:rPr>
+                <w:rFonts w:ascii="Segoe UI" w:hAnsi="Segoe UI" w:eastAsia="宋体"/>
+                <w:b w:val="0"/>
+                <w:i w:val="0"/>
+                <w:sz w:val="16"/>
+              </w:rPr>
+              <w:t>bottle</w:t>
+            </w:r>
+          </w:p>
+        </w:tc>
+        <w:tc>
+          <w:tcPr>
+            <w:tcW w:type="dxa" w:w="1663"/>
+          </w:tcPr>
+          <w:p>
+            <w:pPr>
+              <w:spacing w:before="20" w:after="20" w:line="252" w:lineRule="auto"/>
+            </w:pPr>
+            <w:r/>
+            <w:r>
+              <w:rPr>
+                <w:rFonts w:ascii="Segoe UI" w:hAnsi="Segoe UI" w:eastAsia="宋体"/>
+                <w:b w:val="0"/>
+                <w:i w:val="0"/>
+                <w:sz w:val="16"/>
+              </w:rPr>
+              <w:t>163,856</w:t>
+            </w:r>
+          </w:p>
+        </w:tc>
+        <w:tc>
+          <w:tcPr>
+            <w:tcW w:type="dxa" w:w="1663"/>
+          </w:tcPr>
+          <w:p>
+            <w:pPr>
+              <w:spacing w:before="20" w:after="20" w:line="252" w:lineRule="auto"/>
+            </w:pPr>
+            <w:r/>
+            <w:r>
+              <w:rPr>
+                <w:rFonts w:ascii="Segoe UI" w:hAnsi="Segoe UI" w:eastAsia="宋体"/>
+                <w:b/>
+                <w:i w:val="0"/>
+                <w:sz w:val="16"/>
+              </w:rPr>
+              <w:t>1.0000</w:t>
+            </w:r>
+          </w:p>
+        </w:tc>
+        <w:tc>
+          <w:tcPr>
+            <w:tcW w:type="dxa" w:w="1663"/>
+          </w:tcPr>
+          <w:p>
+            <w:pPr>
+              <w:spacing w:before="20" w:after="20" w:line="252" w:lineRule="auto"/>
+            </w:pPr>
+            <w:r/>
+            <w:r>
+              <w:rPr>
+                <w:rFonts w:ascii="Segoe UI" w:hAnsi="Segoe UI" w:eastAsia="宋体"/>
+                <w:b w:val="0"/>
+                <w:i w:val="0"/>
+                <w:sz w:val="16"/>
+              </w:rPr>
+              <w:t>100.0%</w:t>
+            </w:r>
+          </w:p>
+        </w:tc>
+        <w:tc>
+          <w:tcPr>
+            <w:tcW w:type="dxa" w:w="1663"/>
+          </w:tcPr>
+          <w:p>
+            <w:pPr>
+              <w:spacing w:before="20" w:after="20" w:line="252" w:lineRule="auto"/>
+            </w:pPr>
+            <w:r/>
+            <w:r>
+              <w:rPr>
+                <w:rFonts w:ascii="Segoe UI" w:hAnsi="Segoe UI" w:eastAsia="宋体"/>
+                <w:b w:val="0"/>
+                <w:i w:val="0"/>
+                <w:sz w:val="16"/>
+              </w:rPr>
+              <w:t>0.0</w:t>
+            </w:r>
+          </w:p>
+        </w:tc>
+        <w:tc>
+          <w:tcPr>
+            <w:tcW w:type="dxa" w:w="1663"/>
+          </w:tcPr>
+          <w:p>
+            <w:pPr>
+              <w:spacing w:before="20" w:after="20" w:line="252" w:lineRule="auto"/>
+            </w:pPr>
+            <w:r/>
+            <w:r>
+              <w:rPr>
+                <w:rFonts w:ascii="Segoe UI" w:hAnsi="Segoe UI" w:eastAsia="宋体"/>
+                <w:b w:val="0"/>
+                <w:i w:val="0"/>
+                <w:sz w:val="16"/>
+              </w:rPr>
+              <w:t>达标</w:t>
+            </w:r>
+          </w:p>
+        </w:tc>
+      </w:tr>
+      <w:tr>
+        <w:tc>
+          <w:tcPr>
+            <w:tcW w:type="dxa" w:w="1663"/>
+          </w:tcPr>
+          <w:p>
+            <w:pPr>
+              <w:spacing w:before="20" w:after="20" w:line="252" w:lineRule="auto"/>
+            </w:pPr>
+            <w:r/>
+            <w:r>
+              <w:rPr>
+                <w:rFonts w:ascii="Segoe UI" w:hAnsi="Segoe UI" w:eastAsia="宋体"/>
+                <w:b w:val="0"/>
+                <w:i w:val="0"/>
+                <w:sz w:val="16"/>
+              </w:rPr>
+              <w:t>tile</w:t>
+            </w:r>
+          </w:p>
+        </w:tc>
+        <w:tc>
+          <w:tcPr>
+            <w:tcW w:type="dxa" w:w="1663"/>
+          </w:tcPr>
+          <w:p>
+            <w:pPr>
+              <w:spacing w:before="20" w:after="20" w:line="252" w:lineRule="auto"/>
+            </w:pPr>
+            <w:r/>
+            <w:r>
+              <w:rPr>
+                <w:rFonts w:ascii="Segoe UI" w:hAnsi="Segoe UI" w:eastAsia="宋体"/>
+                <w:b w:val="0"/>
+                <w:i w:val="0"/>
+                <w:sz w:val="16"/>
+              </w:rPr>
+              <w:t>180,320</w:t>
+            </w:r>
+          </w:p>
+        </w:tc>
+        <w:tc>
+          <w:tcPr>
+            <w:tcW w:type="dxa" w:w="1663"/>
+          </w:tcPr>
+          <w:p>
+            <w:pPr>
+              <w:spacing w:before="20" w:after="20" w:line="252" w:lineRule="auto"/>
+            </w:pPr>
+            <w:r/>
+            <w:r>
+              <w:rPr>
+                <w:rFonts w:ascii="Segoe UI" w:hAnsi="Segoe UI" w:eastAsia="宋体"/>
+                <w:b/>
+                <w:i w:val="0"/>
+                <w:sz w:val="16"/>
+              </w:rPr>
+              <w:t>0.9809</w:t>
+            </w:r>
+          </w:p>
+        </w:tc>
+        <w:tc>
+          <w:tcPr>
+            <w:tcW w:type="dxa" w:w="1663"/>
+          </w:tcPr>
+          <w:p>
+            <w:pPr>
+              <w:spacing w:before="20" w:after="20" w:line="252" w:lineRule="auto"/>
+            </w:pPr>
+            <w:r/>
+            <w:r>
+              <w:rPr>
+                <w:rFonts w:ascii="Segoe UI" w:hAnsi="Segoe UI" w:eastAsia="宋体"/>
+                <w:b w:val="0"/>
+                <w:i w:val="0"/>
+                <w:sz w:val="16"/>
+              </w:rPr>
+              <w:t>98.7%</w:t>
+            </w:r>
+          </w:p>
+        </w:tc>
+        <w:tc>
+          <w:tcPr>
+            <w:tcW w:type="dxa" w:w="1663"/>
+          </w:tcPr>
+          <w:p>
+            <w:pPr>
+              <w:spacing w:before="20" w:after="20" w:line="252" w:lineRule="auto"/>
+            </w:pPr>
+            <w:r/>
+            <w:r>
+              <w:rPr>
+                <w:rFonts w:ascii="Segoe UI" w:hAnsi="Segoe UI" w:eastAsia="宋体"/>
+                <w:b w:val="0"/>
+                <w:i w:val="0"/>
+                <w:sz w:val="16"/>
+              </w:rPr>
+              <w:t>−0.6</w:t>
+            </w:r>
+          </w:p>
+        </w:tc>
+        <w:tc>
+          <w:tcPr>
+            <w:tcW w:type="dxa" w:w="1663"/>
+          </w:tcPr>
+          <w:p>
+            <w:pPr>
+              <w:spacing w:before="20" w:after="20" w:line="252" w:lineRule="auto"/>
+            </w:pPr>
+            <w:r/>
+            <w:r>
+              <w:rPr>
+                <w:rFonts w:ascii="Segoe UI" w:hAnsi="Segoe UI" w:eastAsia="宋体"/>
+                <w:b w:val="0"/>
+                <w:i w:val="0"/>
+                <w:sz w:val="16"/>
+              </w:rPr>
+              <w:t>达标（容差内）</w:t>
+            </w:r>
+          </w:p>
+        </w:tc>
+      </w:tr>
+      <w:tr>
+        <w:tc>
+          <w:tcPr>
+            <w:tcW w:type="dxa" w:w="1663"/>
+          </w:tcPr>
+          <w:p>
+            <w:pPr>
+              <w:spacing w:before="20" w:after="20" w:line="252" w:lineRule="auto"/>
+            </w:pPr>
+            <w:r/>
+            <w:r>
+              <w:rPr>
+                <w:rFonts w:ascii="Segoe UI" w:hAnsi="Segoe UI" w:eastAsia="宋体"/>
+                <w:b w:val="0"/>
+                <w:i w:val="0"/>
+                <w:sz w:val="16"/>
+              </w:rPr>
+              <w:t>screw</w:t>
+            </w:r>
+          </w:p>
+        </w:tc>
+        <w:tc>
+          <w:tcPr>
+            <w:tcW w:type="dxa" w:w="1663"/>
+          </w:tcPr>
+          <w:p>
+            <w:pPr>
+              <w:spacing w:before="20" w:after="20" w:line="252" w:lineRule="auto"/>
+            </w:pPr>
+            <w:r/>
+            <w:r>
+              <w:rPr>
+                <w:rFonts w:ascii="Segoe UI" w:hAnsi="Segoe UI" w:eastAsia="宋体"/>
+                <w:b w:val="0"/>
+                <w:i w:val="0"/>
+                <w:sz w:val="16"/>
+              </w:rPr>
+              <w:t>250,880</w:t>
+            </w:r>
+          </w:p>
+        </w:tc>
+        <w:tc>
+          <w:tcPr>
+            <w:tcW w:type="dxa" w:w="1663"/>
+          </w:tcPr>
+          <w:p>
+            <w:pPr>
+              <w:spacing w:before="20" w:after="20" w:line="252" w:lineRule="auto"/>
+            </w:pPr>
+            <w:r/>
+            <w:r>
+              <w:rPr>
+                <w:rFonts w:ascii="Segoe UI" w:hAnsi="Segoe UI" w:eastAsia="宋体"/>
+                <w:b/>
+                <w:i w:val="0"/>
+                <w:sz w:val="16"/>
+              </w:rPr>
+              <w:t>0.9582</w:t>
+            </w:r>
+          </w:p>
+        </w:tc>
+        <w:tc>
+          <w:tcPr>
+            <w:tcW w:type="dxa" w:w="1663"/>
+          </w:tcPr>
+          <w:p>
+            <w:pPr>
+              <w:spacing w:before="20" w:after="20" w:line="252" w:lineRule="auto"/>
+            </w:pPr>
+            <w:r/>
+            <w:r>
+              <w:rPr>
+                <w:rFonts w:ascii="Segoe UI" w:hAnsi="Segoe UI" w:eastAsia="宋体"/>
+                <w:b w:val="0"/>
+                <w:i w:val="0"/>
+                <w:sz w:val="16"/>
+              </w:rPr>
+              <w:t>98.1%</w:t>
+            </w:r>
+          </w:p>
+        </w:tc>
+        <w:tc>
+          <w:tcPr>
+            <w:tcW w:type="dxa" w:w="1663"/>
+          </w:tcPr>
+          <w:p>
+            <w:pPr>
+              <w:spacing w:before="20" w:after="20" w:line="252" w:lineRule="auto"/>
+            </w:pPr>
+            <w:r/>
+            <w:r>
+              <w:rPr>
+                <w:rFonts w:ascii="Segoe UI" w:hAnsi="Segoe UI" w:eastAsia="宋体"/>
+                <w:b/>
+                <w:i w:val="0"/>
+                <w:sz w:val="16"/>
+              </w:rPr>
+              <w:t>−2.3</w:t>
+            </w:r>
+          </w:p>
+        </w:tc>
+        <w:tc>
+          <w:tcPr>
+            <w:tcW w:type="dxa" w:w="1663"/>
+          </w:tcPr>
+          <w:p>
+            <w:pPr>
+              <w:spacing w:before="20" w:after="20" w:line="252" w:lineRule="auto"/>
+            </w:pPr>
+            <w:r/>
+            <w:r>
+              <w:rPr>
+                <w:rFonts w:ascii="Segoe UI" w:hAnsi="Segoe UI" w:eastAsia="宋体"/>
+                <w:b/>
+                <w:i w:val="0"/>
+                <w:sz w:val="16"/>
+              </w:rPr>
+              <w:t>未达标（超容差）</w:t>
+            </w:r>
+          </w:p>
+        </w:tc>
+      </w:tr>
+    </w:tbl>
+    <w:p>
+      <w:pPr>
+        <w:spacing w:before="0" w:after="80" w:line="264" w:lineRule="auto"/>
+      </w:pPr>
+      <w:r>
+        <w:rPr>
+          <w:rFonts w:ascii="Segoe UI" w:hAnsi="Segoe UI" w:eastAsia="宋体"/>
+          <w:b/>
+          <w:i w:val="0"/>
+          <w:sz w:val="20"/>
+        </w:rPr>
+        <w:t>偏离项（逐条列明，未调参掩盖）</w:t>
+      </w:r>
+    </w:p>
+    <w:p>
+      <w:pPr>
+        <w:spacing w:after="40" w:line="283" w:lineRule="auto"/>
+        <w:ind w:left="425" w:hanging="425"/>
+      </w:pPr>
+      <w:r>
+        <w:rPr>
+          <w:rFonts w:ascii="Segoe UI" w:hAnsi="Segoe UI" w:eastAsia="宋体"/>
+          <w:b w:val="0"/>
+          <w:i w:val="0"/>
+          <w:sz w:val="20"/>
+        </w:rPr>
+        <w:t>1. 无 PatchCore 的重加权分数（本文只用 max-score，因为区间证明只覆盖 max）；</w:t>
+      </w:r>
+    </w:p>
+    <w:p>
+      <w:pPr>
+        <w:spacing w:after="40" w:line="283" w:lineRule="auto"/>
+        <w:ind w:left="425" w:hanging="425"/>
+      </w:pPr>
+      <w:r>
+        <w:rPr>
+          <w:rFonts w:ascii="Segoe UI" w:hAnsi="Segoe UI" w:eastAsia="宋体"/>
+          <w:b w:val="0"/>
+          <w:i w:val="0"/>
+          <w:sz w:val="20"/>
+        </w:rPr>
+        <w:t xml:space="preserve">2. 无 </w:t>
+      </w:r>
+      <w:r>
+        <w:rPr>
+          <w:rFonts w:ascii="Consolas" w:hAnsi="Consolas" w:eastAsia="Consolas"/>
+          <w:b w:val="0"/>
+          <w:color w:val="B03030"/>
+          <w:sz w:val="19"/>
+        </w:rPr>
+        <w:t>--pretrain_embed_dimension 1024</w:t>
+      </w:r>
+      <w:r>
+        <w:rPr>
+          <w:rFonts w:ascii="Segoe UI" w:hAnsi="Segoe UI" w:eastAsia="宋体"/>
+          <w:b w:val="0"/>
+          <w:i w:val="0"/>
+          <w:sz w:val="20"/>
+        </w:rPr>
+        <w:t xml:space="preserve"> 的随机投影（保留 1536 维）；</w:t>
+      </w:r>
+    </w:p>
+    <w:p>
+      <w:pPr>
+        <w:spacing w:after="40" w:line="283" w:lineRule="auto"/>
+        <w:ind w:left="425" w:hanging="425"/>
+      </w:pPr>
+      <w:r>
+        <w:rPr>
+          <w:rFonts w:ascii="Segoe UI" w:hAnsi="Segoe UI" w:eastAsia="宋体"/>
+          <w:b w:val="0"/>
+          <w:i w:val="0"/>
+          <w:sz w:val="20"/>
+        </w:rPr>
+        <w:t>3. 未用 FAISS 的精确保留（本文为分块 torch 距离）；</w:t>
+      </w:r>
+    </w:p>
+    <w:p>
+      <w:pPr>
+        <w:spacing w:after="40" w:line="283" w:lineRule="auto"/>
+        <w:ind w:left="425" w:hanging="425"/>
+      </w:pPr>
+      <w:r>
+        <w:rPr>
+          <w:rFonts w:ascii="Segoe UI" w:hAnsi="Segoe UI" w:eastAsia="宋体"/>
+          <w:b w:val="0"/>
+          <w:i w:val="0"/>
+          <w:sz w:val="20"/>
+        </w:rPr>
+        <w:t>4. torch 2.6 / py3.10（论文为 1.x / py3.8）；</w:t>
+      </w:r>
+    </w:p>
+    <w:p>
+      <w:pPr>
+        <w:spacing w:after="40" w:line="283" w:lineRule="auto"/>
+        <w:ind w:left="425" w:hanging="425"/>
+      </w:pPr>
+      <w:r>
+        <w:rPr>
+          <w:rFonts w:ascii="Segoe UI" w:hAnsi="Segoe UI" w:eastAsia="宋体"/>
+          <w:b w:val="0"/>
+          <w:i w:val="0"/>
+          <w:sz w:val="20"/>
+        </w:rPr>
+        <w:t>5. 图像 224px、batch 8（与论文默认一致）。</w:t>
+      </w:r>
+    </w:p>
+    <w:p>
+      <w:pPr>
+        <w:spacing w:before="0" w:after="40" w:line="264" w:lineRule="auto"/>
+        <w:ind w:left="283"/>
+      </w:pPr>
+      <w:r>
+        <w:rPr>
+          <w:rFonts w:ascii="Segoe UI" w:hAnsi="Segoe UI" w:eastAsia="宋体"/>
+          <w:b/>
+          <w:i/>
+          <w:color w:val="444444"/>
+          <w:sz w:val="19"/>
+        </w:rPr>
+        <w:t>注意</w:t>
+      </w:r>
+      <w:r>
+        <w:rPr>
+          <w:rFonts w:ascii="Segoe UI" w:hAnsi="Segoe UI" w:eastAsia="宋体"/>
+          <w:b w:val="0"/>
+          <w:i/>
+          <w:color w:val="444444"/>
+          <w:sz w:val="19"/>
+        </w:rPr>
+        <w:t>：复现模式下阈值会塌缩（全量库包含校准图自身 → 最近邻距离≈0 → t≈0.01 → FAR=100%）。</w:t>
+      </w:r>
+    </w:p>
+    <w:p>
+      <w:pPr>
+        <w:spacing w:before="0" w:after="40" w:line="264" w:lineRule="auto"/>
+        <w:ind w:left="283"/>
+      </w:pPr>
+      <w:r>
+        <w:rPr>
+          <w:rFonts w:ascii="Segoe UI" w:hAnsi="Segoe UI" w:eastAsia="宋体"/>
+          <w:b w:val="0"/>
+          <w:i/>
+          <w:color w:val="444444"/>
+          <w:sz w:val="19"/>
+        </w:rPr>
+        <w:t>因此</w:t>
+      </w:r>
+      <w:r>
+        <w:rPr>
+          <w:rFonts w:ascii="Segoe UI" w:hAnsi="Segoe UI" w:eastAsia="宋体"/>
+          <w:b/>
+          <w:i/>
+          <w:color w:val="444444"/>
+          <w:sz w:val="19"/>
+        </w:rPr>
+        <w:t>复现模式只报 AUROC（与阈值无关）</w:t>
+      </w:r>
+      <w:r>
+        <w:rPr>
+          <w:rFonts w:ascii="Segoe UI" w:hAnsi="Segoe UI" w:eastAsia="宋体"/>
+          <w:b w:val="0"/>
+          <w:i/>
+          <w:color w:val="444444"/>
+          <w:sz w:val="19"/>
+        </w:rPr>
+        <w:t>；一切与阈值有关的数字都来自互斥角色的决策实验。</w:t>
+      </w:r>
+    </w:p>
+    <w:p>
+      <w:pPr>
+        <w:spacing w:before="180" w:after="80" w:line="264" w:lineRule="auto"/>
+      </w:pPr>
+      <w:r>
+        <w:rPr>
+          <w:rFonts w:ascii="Segoe UI Semibold" w:hAnsi="Segoe UI Semibold" w:eastAsia="微软雅黑"/>
+          <w:b/>
+          <w:i w:val="0"/>
+          <w:sz w:val="23"/>
+        </w:rPr>
+        <w:t>5.3 Phase 3 决策实验（16-shot：库 12,544 patch，阈值 = 校准集 95 分位）</w:t>
+      </w:r>
+    </w:p>
+    <w:tbl>
+      <w:tblPr>
+        <w:tblStyle w:val="TableGrid"/>
+        <w:tblW w:type="auto" w:w="0"/>
+        <w:jc w:val="center"/>
+        <w:tblLayout w:type="fixed"/>
+        <w:tblLook w:firstColumn="1" w:firstRow="1" w:lastColumn="0" w:lastRow="0" w:noHBand="0" w:noVBand="1" w:val="04A0"/>
+      </w:tblPr>
+      <w:tblGrid>
+        <w:gridCol w:w="1109"/>
+        <w:gridCol w:w="1109"/>
+        <w:gridCol w:w="1109"/>
+        <w:gridCol w:w="1109"/>
+        <w:gridCol w:w="1109"/>
+        <w:gridCol w:w="1109"/>
+        <w:gridCol w:w="1109"/>
+        <w:gridCol w:w="1109"/>
+        <w:gridCol w:w="1109"/>
+      </w:tblGrid>
+      <w:tr>
+        <w:trPr>
+          <w:tblHeader w:val="true"/>
+        </w:trPr>
+        <w:tc>
+          <w:tcPr>
+            <w:tcW w:type="dxa" w:w="1109"/>
+            <w:shd w:val="clear" w:color="auto" w:fill="EFEFEF"/>
+          </w:tcPr>
+          <w:p>
+            <w:pPr>
+              <w:spacing w:before="20" w:after="20" w:line="252" w:lineRule="auto"/>
+              <w:jc w:val="center"/>
+            </w:pPr>
+            <w:r/>
+            <w:r>
+              <w:rPr>
+                <w:rFonts w:ascii="Segoe UI Semibold" w:hAnsi="Segoe UI Semibold" w:eastAsia="微软雅黑"/>
+                <w:b/>
+                <w:i w:val="0"/>
+                <w:sz w:val="16"/>
+              </w:rPr>
+              <w:t>类别</w:t>
+            </w:r>
+          </w:p>
+        </w:tc>
+        <w:tc>
+          <w:tcPr>
+            <w:tcW w:type="dxa" w:w="1109"/>
+            <w:shd w:val="clear" w:color="auto" w:fill="EFEFEF"/>
+          </w:tcPr>
+          <w:p>
+            <w:pPr>
+              <w:spacing w:before="20" w:after="20" w:line="252" w:lineRule="auto"/>
+              <w:jc w:val="center"/>
+            </w:pPr>
+            <w:r/>
+            <w:r>
+              <w:rPr>
+                <w:rFonts w:ascii="Segoe UI Semibold" w:hAnsi="Segoe UI Semibold" w:eastAsia="微软雅黑"/>
+                <w:b/>
+                <w:i w:val="0"/>
+                <w:sz w:val="16"/>
+              </w:rPr>
+              <w:t>全库 FAR / 召回</w:t>
+            </w:r>
+          </w:p>
+        </w:tc>
+        <w:tc>
+          <w:tcPr>
+            <w:tcW w:type="dxa" w:w="1109"/>
+            <w:shd w:val="clear" w:color="auto" w:fill="EFEFEF"/>
+          </w:tcPr>
+          <w:p>
+            <w:pPr>
+              <w:spacing w:before="20" w:after="20" w:line="252" w:lineRule="auto"/>
+              <w:jc w:val="center"/>
+            </w:pPr>
+            <w:r/>
+            <w:r>
+              <w:rPr>
+                <w:rFonts w:ascii="Segoe UI Semibold" w:hAnsi="Segoe UI Semibold" w:eastAsia="微软雅黑"/>
+                <w:b/>
+                <w:i w:val="0"/>
+                <w:sz w:val="16"/>
+              </w:rPr>
+              <w:t>1% 分歧</w:t>
+            </w:r>
+          </w:p>
+        </w:tc>
+        <w:tc>
+          <w:tcPr>
+            <w:tcW w:type="dxa" w:w="1109"/>
+            <w:shd w:val="clear" w:color="auto" w:fill="EFEFEF"/>
+          </w:tcPr>
+          <w:p>
+            <w:pPr>
+              <w:spacing w:before="20" w:after="20" w:line="252" w:lineRule="auto"/>
+              <w:jc w:val="center"/>
+            </w:pPr>
+            <w:r/>
+            <w:r>
+              <w:rPr>
+                <w:rFonts w:ascii="Segoe UI Semibold" w:hAnsi="Segoe UI Semibold" w:eastAsia="微软雅黑"/>
+                <w:b/>
+                <w:i w:val="0"/>
+                <w:sz w:val="16"/>
+              </w:rPr>
+              <w:t>5% 分歧</w:t>
+            </w:r>
+          </w:p>
+        </w:tc>
+        <w:tc>
+          <w:tcPr>
+            <w:tcW w:type="dxa" w:w="1109"/>
+            <w:shd w:val="clear" w:color="auto" w:fill="EFEFEF"/>
+          </w:tcPr>
+          <w:p>
+            <w:pPr>
+              <w:spacing w:before="20" w:after="20" w:line="252" w:lineRule="auto"/>
+              <w:jc w:val="center"/>
+            </w:pPr>
+            <w:r/>
+            <w:r>
+              <w:rPr>
+                <w:rFonts w:ascii="Segoe UI Semibold" w:hAnsi="Segoe UI Semibold" w:eastAsia="微软雅黑"/>
+                <w:b/>
+                <w:i w:val="0"/>
+                <w:sz w:val="16"/>
+              </w:rPr>
+              <w:t>10% 分歧</w:t>
+            </w:r>
+          </w:p>
+        </w:tc>
+        <w:tc>
+          <w:tcPr>
+            <w:tcW w:type="dxa" w:w="1109"/>
+            <w:shd w:val="clear" w:color="auto" w:fill="EFEFEF"/>
+          </w:tcPr>
+          <w:p>
+            <w:pPr>
+              <w:spacing w:before="20" w:after="20" w:line="252" w:lineRule="auto"/>
+              <w:jc w:val="center"/>
+            </w:pPr>
+            <w:r/>
+            <w:r>
+              <w:rPr>
+                <w:rFonts w:ascii="Segoe UI Semibold" w:hAnsi="Segoe UI Semibold" w:eastAsia="微软雅黑"/>
+                <w:b/>
+                <w:i w:val="0"/>
+                <w:sz w:val="16"/>
+              </w:rPr>
+              <w:t>25% 分歧</w:t>
+            </w:r>
+          </w:p>
+        </w:tc>
+        <w:tc>
+          <w:tcPr>
+            <w:tcW w:type="dxa" w:w="1109"/>
+            <w:shd w:val="clear" w:color="auto" w:fill="EFEFEF"/>
+          </w:tcPr>
+          <w:p>
+            <w:pPr>
+              <w:spacing w:before="20" w:after="20" w:line="252" w:lineRule="auto"/>
+              <w:jc w:val="center"/>
+            </w:pPr>
+            <w:r/>
+            <w:r>
+              <w:rPr>
+                <w:rFonts w:ascii="Segoe UI Semibold" w:hAnsi="Segoe UI Semibold" w:eastAsia="微软雅黑"/>
+                <w:b/>
+                <w:i w:val="0"/>
+                <w:sz w:val="16"/>
+              </w:rPr>
+              <w:t>重校准后（10%）</w:t>
+            </w:r>
+          </w:p>
+        </w:tc>
+        <w:tc>
+          <w:tcPr>
+            <w:tcW w:type="dxa" w:w="1109"/>
             <w:shd w:val="clear" w:color="auto" w:fill="EFEFEF"/>
           </w:tcPr>
           <w:p>
@@ -3752,7 +4209,7 @@
         </w:tc>
         <w:tc>
           <w:tcPr>
-            <w:tcW w:type="dxa" w:w="1996"/>
+            <w:tcW w:type="dxa" w:w="1109"/>
             <w:shd w:val="clear" w:color="auto" w:fill="EFEFEF"/>
           </w:tcPr>
           <w:p>
@@ -3768,7 +4225,7 @@
                 <w:i w:val="0"/>
                 <w:sz w:val="16"/>
               </w:rPr>
-              <w:t>本地解决不一致</w:t>
+              <w:t>本地错判</w:t>
             </w:r>
           </w:p>
         </w:tc>
@@ -3776,7 +4233,7 @@
       <w:tr>
         <w:tc>
           <w:tcPr>
-            <w:tcW w:type="dxa" w:w="1996"/>
+            <w:tcW w:type="dxa" w:w="1109"/>
           </w:tcPr>
           <w:p>
             <w:pPr>
@@ -3790,13 +4247,13 @@
                 <w:i w:val="0"/>
                 <w:sz w:val="16"/>
               </w:rPr>
-              <w:t>compact_tight</w:t>
+              <w:t>bottle</w:t>
             </w:r>
           </w:p>
         </w:tc>
         <w:tc>
           <w:tcPr>
-            <w:tcW w:type="dxa" w:w="1996"/>
+            <w:tcW w:type="dxa" w:w="1109"/>
           </w:tcPr>
           <w:p>
             <w:pPr>
@@ -3810,13 +4267,33 @@
                 <w:i w:val="0"/>
                 <w:sz w:val="16"/>
               </w:rPr>
-              <w:t>46.3%</w:t>
+              <w:t>0.0% / 100%</w:t>
             </w:r>
           </w:p>
         </w:tc>
         <w:tc>
           <w:tcPr>
-            <w:tcW w:type="dxa" w:w="1996"/>
+            <w:tcW w:type="dxa" w:w="1109"/>
+          </w:tcPr>
+          <w:p>
+            <w:pPr>
+              <w:spacing w:before="20" w:after="20" w:line="252" w:lineRule="auto"/>
+            </w:pPr>
+            <w:r/>
+            <w:r>
+              <w:rPr>
+                <w:rFonts w:ascii="Segoe UI" w:hAnsi="Segoe UI" w:eastAsia="宋体"/>
+                <w:b/>
+                <w:i w:val="0"/>
+                <w:sz w:val="16"/>
+              </w:rPr>
+              <w:t>24.10%</w:t>
+            </w:r>
+          </w:p>
+        </w:tc>
+        <w:tc>
+          <w:tcPr>
+            <w:tcW w:type="dxa" w:w="1109"/>
           </w:tcPr>
           <w:p>
             <w:pPr>
@@ -3830,13 +4307,13 @@
                 <w:i w:val="0"/>
                 <w:sz w:val="16"/>
               </w:rPr>
-              <w:t>4.5%</w:t>
+              <w:t>3.61%</w:t>
             </w:r>
           </w:p>
         </w:tc>
         <w:tc>
           <w:tcPr>
-            <w:tcW w:type="dxa" w:w="1996"/>
+            <w:tcW w:type="dxa" w:w="1109"/>
           </w:tcPr>
           <w:p>
             <w:pPr>
@@ -3850,13 +4327,73 @@
                 <w:i w:val="0"/>
                 <w:sz w:val="16"/>
               </w:rPr>
-              <w:t>55.8%</w:t>
+              <w:t>0.00%</w:t>
             </w:r>
           </w:p>
         </w:tc>
         <w:tc>
           <w:tcPr>
-            <w:tcW w:type="dxa" w:w="1996"/>
+            <w:tcW w:type="dxa" w:w="1109"/>
+          </w:tcPr>
+          <w:p>
+            <w:pPr>
+              <w:spacing w:before="20" w:after="20" w:line="252" w:lineRule="auto"/>
+            </w:pPr>
+            <w:r/>
+            <w:r>
+              <w:rPr>
+                <w:rFonts w:ascii="Segoe UI" w:hAnsi="Segoe UI" w:eastAsia="宋体"/>
+                <w:b w:val="0"/>
+                <w:i w:val="0"/>
+                <w:sz w:val="16"/>
+              </w:rPr>
+              <w:t>0.00%</w:t>
+            </w:r>
+          </w:p>
+        </w:tc>
+        <w:tc>
+          <w:tcPr>
+            <w:tcW w:type="dxa" w:w="1109"/>
+          </w:tcPr>
+          <w:p>
+            <w:pPr>
+              <w:spacing w:before="20" w:after="20" w:line="252" w:lineRule="auto"/>
+            </w:pPr>
+            <w:r/>
+            <w:r>
+              <w:rPr>
+                <w:rFonts w:ascii="Segoe UI" w:hAnsi="Segoe UI" w:eastAsia="宋体"/>
+                <w:b w:val="0"/>
+                <w:i w:val="0"/>
+                <w:sz w:val="16"/>
+              </w:rPr>
+              <w:t>0.00%</w:t>
+            </w:r>
+          </w:p>
+        </w:tc>
+        <w:tc>
+          <w:tcPr>
+            <w:tcW w:type="dxa" w:w="1109"/>
+          </w:tcPr>
+          <w:p>
+            <w:pPr>
+              <w:spacing w:before="20" w:after="20" w:line="252" w:lineRule="auto"/>
+            </w:pPr>
+            <w:r/>
+            <w:r>
+              <w:rPr>
+                <w:rFonts w:ascii="Segoe UI" w:hAnsi="Segoe UI" w:eastAsia="宋体"/>
+                <w:b w:val="0"/>
+                <w:i w:val="0"/>
+                <w:sz w:val="16"/>
+              </w:rPr>
+              <w:t>8.4%</w:t>
+            </w:r>
+          </w:p>
+        </w:tc>
+        <w:tc>
+          <w:tcPr>
+            <w:tcW w:type="dxa" w:w="1109"/>
           </w:tcPr>
           <w:p>
             <w:pPr>
@@ -3878,7 +4415,7 @@
       <w:tr>
         <w:tc>
           <w:tcPr>
-            <w:tcW w:type="dxa" w:w="1996"/>
+            <w:tcW w:type="dxa" w:w="1109"/>
           </w:tcPr>
           <w:p>
             <w:pPr>
@@ -3892,13 +4429,13 @@
                 <w:i w:val="0"/>
                 <w:sz w:val="16"/>
               </w:rPr>
-              <w:t>medium</w:t>
+              <w:t>tile</w:t>
             </w:r>
           </w:p>
         </w:tc>
         <w:tc>
           <w:tcPr>
-            <w:tcW w:type="dxa" w:w="1996"/>
+            <w:tcW w:type="dxa" w:w="1109"/>
           </w:tcPr>
           <w:p>
             <w:pPr>
@@ -3912,13 +4449,33 @@
                 <w:i w:val="0"/>
                 <w:sz w:val="16"/>
               </w:rPr>
-              <w:t>49.3%</w:t>
+              <w:t>0.0% / 84.5%</w:t>
             </w:r>
           </w:p>
         </w:tc>
         <w:tc>
           <w:tcPr>
-            <w:tcW w:type="dxa" w:w="1996"/>
+            <w:tcW w:type="dxa" w:w="1109"/>
+          </w:tcPr>
+          <w:p>
+            <w:pPr>
+              <w:spacing w:before="20" w:after="20" w:line="252" w:lineRule="auto"/>
+            </w:pPr>
+            <w:r/>
+            <w:r>
+              <w:rPr>
+                <w:rFonts w:ascii="Segoe UI" w:hAnsi="Segoe UI" w:eastAsia="宋体"/>
+                <w:b/>
+                <w:i w:val="0"/>
+                <w:sz w:val="16"/>
+              </w:rPr>
+              <w:t>11.97%</w:t>
+            </w:r>
+          </w:p>
+        </w:tc>
+        <w:tc>
+          <w:tcPr>
+            <w:tcW w:type="dxa" w:w="1109"/>
           </w:tcPr>
           <w:p>
             <w:pPr>
@@ -3932,13 +4489,13 @@
                 <w:i w:val="0"/>
                 <w:sz w:val="16"/>
               </w:rPr>
-              <w:t>8.5%</w:t>
+              <w:t>3.42%</w:t>
             </w:r>
           </w:p>
         </w:tc>
         <w:tc>
           <w:tcPr>
-            <w:tcW w:type="dxa" w:w="1996"/>
+            <w:tcW w:type="dxa" w:w="1109"/>
           </w:tcPr>
           <w:p>
             <w:pPr>
@@ -3952,13 +4509,73 @@
                 <w:i w:val="0"/>
                 <w:sz w:val="16"/>
               </w:rPr>
-              <w:t>81.0%</w:t>
+              <w:t>2.56%</w:t>
             </w:r>
           </w:p>
         </w:tc>
         <w:tc>
           <w:tcPr>
-            <w:tcW w:type="dxa" w:w="1996"/>
+            <w:tcW w:type="dxa" w:w="1109"/>
+          </w:tcPr>
+          <w:p>
+            <w:pPr>
+              <w:spacing w:before="20" w:after="20" w:line="252" w:lineRule="auto"/>
+            </w:pPr>
+            <w:r/>
+            <w:r>
+              <w:rPr>
+                <w:rFonts w:ascii="Segoe UI" w:hAnsi="Segoe UI" w:eastAsia="宋体"/>
+                <w:b w:val="0"/>
+                <w:i w:val="0"/>
+                <w:sz w:val="16"/>
+              </w:rPr>
+              <w:t>2.56%</w:t>
+            </w:r>
+          </w:p>
+        </w:tc>
+        <w:tc>
+          <w:tcPr>
+            <w:tcW w:type="dxa" w:w="1109"/>
+          </w:tcPr>
+          <w:p>
+            <w:pPr>
+              <w:spacing w:before="20" w:after="20" w:line="252" w:lineRule="auto"/>
+            </w:pPr>
+            <w:r/>
+            <w:r>
+              <w:rPr>
+                <w:rFonts w:ascii="Segoe UI" w:hAnsi="Segoe UI" w:eastAsia="宋体"/>
+                <w:b w:val="0"/>
+                <w:i w:val="0"/>
+                <w:sz w:val="16"/>
+              </w:rPr>
+              <w:t>1.71%</w:t>
+            </w:r>
+          </w:p>
+        </w:tc>
+        <w:tc>
+          <w:tcPr>
+            <w:tcW w:type="dxa" w:w="1109"/>
+          </w:tcPr>
+          <w:p>
+            <w:pPr>
+              <w:spacing w:before="20" w:after="20" w:line="252" w:lineRule="auto"/>
+            </w:pPr>
+            <w:r/>
+            <w:r>
+              <w:rPr>
+                <w:rFonts w:ascii="Segoe UI" w:hAnsi="Segoe UI" w:eastAsia="宋体"/>
+                <w:b w:val="0"/>
+                <w:i w:val="0"/>
+                <w:sz w:val="16"/>
+              </w:rPr>
+              <w:t>59.8%</w:t>
+            </w:r>
+          </w:p>
+        </w:tc>
+        <w:tc>
+          <w:tcPr>
+            <w:tcW w:type="dxa" w:w="1109"/>
           </w:tcPr>
           <w:p>
             <w:pPr>
@@ -3980,7 +4597,7 @@
       <w:tr>
         <w:tc>
           <w:tcPr>
-            <w:tcW w:type="dxa" w:w="1996"/>
+            <w:tcW w:type="dxa" w:w="1109"/>
           </w:tcPr>
           <w:p>
             <w:pPr>
@@ -3994,13 +4611,13 @@
                 <w:i w:val="0"/>
                 <w:sz w:val="16"/>
               </w:rPr>
-              <w:t>broad_hard</w:t>
+              <w:t>screw</w:t>
             </w:r>
           </w:p>
         </w:tc>
         <w:tc>
           <w:tcPr>
-            <w:tcW w:type="dxa" w:w="1996"/>
+            <w:tcW w:type="dxa" w:w="1109"/>
           </w:tcPr>
           <w:p>
             <w:pPr>
@@ -4014,13 +4631,33 @@
                 <w:i w:val="0"/>
                 <w:sz w:val="16"/>
               </w:rPr>
-              <w:t>71.8%</w:t>
+              <w:t>9.8% / 11.8%</w:t>
             </w:r>
           </w:p>
         </w:tc>
         <w:tc>
           <w:tcPr>
-            <w:tcW w:type="dxa" w:w="1996"/>
+            <w:tcW w:type="dxa" w:w="1109"/>
+          </w:tcPr>
+          <w:p>
+            <w:pPr>
+              <w:spacing w:before="20" w:after="20" w:line="252" w:lineRule="auto"/>
+            </w:pPr>
+            <w:r/>
+            <w:r>
+              <w:rPr>
+                <w:rFonts w:ascii="Segoe UI" w:hAnsi="Segoe UI" w:eastAsia="宋体"/>
+                <w:b/>
+                <w:i w:val="0"/>
+                <w:sz w:val="16"/>
+              </w:rPr>
+              <w:t>41.88%</w:t>
+            </w:r>
+          </w:p>
+        </w:tc>
+        <w:tc>
+          <w:tcPr>
+            <w:tcW w:type="dxa" w:w="1109"/>
           </w:tcPr>
           <w:p>
             <w:pPr>
@@ -4034,13 +4671,13 @@
                 <w:i w:val="0"/>
                 <w:sz w:val="16"/>
               </w:rPr>
-              <w:t>15.3%</w:t>
+              <w:t>7.50%</w:t>
             </w:r>
           </w:p>
         </w:tc>
         <w:tc>
           <w:tcPr>
-            <w:tcW w:type="dxa" w:w="1996"/>
+            <w:tcW w:type="dxa" w:w="1109"/>
           </w:tcPr>
           <w:p>
             <w:pPr>
@@ -4054,13 +4691,73 @@
                 <w:i w:val="0"/>
                 <w:sz w:val="16"/>
               </w:rPr>
-              <w:t>100.0%</w:t>
+              <w:t>3.12%</w:t>
             </w:r>
           </w:p>
         </w:tc>
         <w:tc>
           <w:tcPr>
-            <w:tcW w:type="dxa" w:w="1996"/>
+            <w:tcW w:type="dxa" w:w="1109"/>
+          </w:tcPr>
+          <w:p>
+            <w:pPr>
+              <w:spacing w:before="20" w:after="20" w:line="252" w:lineRule="auto"/>
+            </w:pPr>
+            <w:r/>
+            <w:r>
+              <w:rPr>
+                <w:rFonts w:ascii="Segoe UI" w:hAnsi="Segoe UI" w:eastAsia="宋体"/>
+                <w:b w:val="0"/>
+                <w:i w:val="0"/>
+                <w:sz w:val="16"/>
+              </w:rPr>
+              <w:t>0.00%</w:t>
+            </w:r>
+          </w:p>
+        </w:tc>
+        <w:tc>
+          <w:tcPr>
+            <w:tcW w:type="dxa" w:w="1109"/>
+          </w:tcPr>
+          <w:p>
+            <w:pPr>
+              <w:spacing w:before="20" w:after="20" w:line="252" w:lineRule="auto"/>
+            </w:pPr>
+            <w:r/>
+            <w:r>
+              <w:rPr>
+                <w:rFonts w:ascii="Segoe UI" w:hAnsi="Segoe UI" w:eastAsia="宋体"/>
+                <w:b w:val="0"/>
+                <w:i w:val="0"/>
+                <w:sz w:val="16"/>
+              </w:rPr>
+              <w:t>2.50%</w:t>
+            </w:r>
+          </w:p>
+        </w:tc>
+        <w:tc>
+          <w:tcPr>
+            <w:tcW w:type="dxa" w:w="1109"/>
+          </w:tcPr>
+          <w:p>
+            <w:pPr>
+              <w:spacing w:before="20" w:after="20" w:line="252" w:lineRule="auto"/>
+            </w:pPr>
+            <w:r/>
+            <w:r>
+              <w:rPr>
+                <w:rFonts w:ascii="Segoe UI" w:hAnsi="Segoe UI" w:eastAsia="宋体"/>
+                <w:b w:val="0"/>
+                <w:i w:val="0"/>
+                <w:sz w:val="16"/>
+              </w:rPr>
+              <w:t>14.4%</w:t>
+            </w:r>
+          </w:p>
+        </w:tc>
+        <w:tc>
+          <w:tcPr>
+            <w:tcW w:type="dxa" w:w="1109"/>
           </w:tcPr>
           <w:p>
             <w:pPr>
@@ -4082,7 +4779,8 @@
     </w:tbl>
     <w:p>
       <w:pPr>
-        <w:spacing w:before="0" w:after="80" w:line="264" w:lineRule="auto"/>
+        <w:pStyle w:val="ListBullet"/>
+        <w:spacing w:after="40" w:line="283" w:lineRule="auto"/>
       </w:pPr>
       <w:r>
         <w:rPr>
@@ -4091,7 +4789,7 @@
           <w:i w:val="0"/>
           <w:sz w:val="20"/>
         </w:rPr>
-        <w:t>边界声明</w:t>
+        <w:t>全部 720 条分歧均为多报，漏报 0</w:t>
       </w:r>
       <w:r>
         <w:rPr>
@@ -4100,7 +4798,169 @@
           <w:i w:val="0"/>
           <w:sz w:val="20"/>
         </w:rPr>
-        <w:t>：这三档是难度代理，不代表 bottle/tile/screw 的任何数值；不能写入论文表 2。用途是验证实验设计与失效模式，数据到位后用同一代码在真实特征上复跑。</w:t>
+        <w:t>：压缩只让距离变大，决策单向往报警侧移动。</w:t>
+      </w:r>
+    </w:p>
+    <w:p>
+      <w:pPr>
+        <w:pStyle w:val="ListBullet"/>
+        <w:spacing w:after="40" w:line="283" w:lineRule="auto"/>
+      </w:pPr>
+      <w:r>
+        <w:rPr>
+          <w:rFonts w:ascii="Segoe UI" w:hAnsi="Segoe UI" w:eastAsia="宋体"/>
+          <w:b w:val="0"/>
+          <w:i w:val="0"/>
+          <w:sz w:val="20"/>
+        </w:rPr>
+        <w:t>区间宽度：半径均值 0.95 / 1.26 / 1.22；升级率与半径正相关，与检测器余量反相关。</w:t>
+      </w:r>
+    </w:p>
+    <w:p>
+      <w:pPr>
+        <w:pStyle w:val="ListBullet"/>
+        <w:spacing w:after="40" w:line="283" w:lineRule="auto"/>
+      </w:pPr>
+      <w:r>
+        <w:rPr>
+          <w:rFonts w:ascii="Segoe UI" w:hAnsi="Segoe UI" w:eastAsia="宋体"/>
+          <w:b w:val="0"/>
+          <w:i w:val="0"/>
+          <w:sz w:val="20"/>
+        </w:rPr>
+        <w:t>原始数据：</w:t>
+      </w:r>
+      <w:r>
+        <w:rPr>
+          <w:rFonts w:ascii="Consolas" w:hAnsi="Consolas" w:eastAsia="Consolas"/>
+          <w:b w:val="0"/>
+          <w:color w:val="B03030"/>
+          <w:sz w:val="19"/>
+        </w:rPr>
+        <w:t>logs/w3_decision_16shot.json</w:t>
+      </w:r>
+      <w:r>
+        <w:rPr>
+          <w:rFonts w:ascii="Segoe UI" w:hAnsi="Segoe UI" w:eastAsia="宋体"/>
+          <w:b w:val="0"/>
+          <w:i w:val="0"/>
+          <w:sz w:val="20"/>
+        </w:rPr>
+        <w:t>、</w:t>
+      </w:r>
+      <w:r>
+        <w:rPr>
+          <w:rFonts w:ascii="Consolas" w:hAnsi="Consolas" w:eastAsia="Consolas"/>
+          <w:b w:val="0"/>
+          <w:color w:val="B03030"/>
+          <w:sz w:val="19"/>
+        </w:rPr>
+        <w:t>logs/w3_repro.json</w:t>
+      </w:r>
+      <w:r>
+        <w:rPr>
+          <w:rFonts w:ascii="Segoe UI" w:hAnsi="Segoe UI" w:eastAsia="宋体"/>
+          <w:b w:val="0"/>
+          <w:i w:val="0"/>
+          <w:sz w:val="20"/>
+        </w:rPr>
+        <w:t>；图：</w:t>
+      </w:r>
+      <w:r>
+        <w:rPr>
+          <w:rFonts w:ascii="Consolas" w:hAnsi="Consolas" w:eastAsia="Consolas"/>
+          <w:b w:val="0"/>
+          <w:color w:val="B03030"/>
+          <w:sz w:val="19"/>
+        </w:rPr>
+        <w:t>reports/figures/figure_5/6_*</w:t>
+      </w:r>
+      <w:r>
+        <w:rPr>
+          <w:rFonts w:ascii="Segoe UI" w:hAnsi="Segoe UI" w:eastAsia="宋体"/>
+          <w:b w:val="0"/>
+          <w:i w:val="0"/>
+          <w:sz w:val="20"/>
+        </w:rPr>
+        <w:t>。</w:t>
+      </w:r>
+    </w:p>
+    <w:p>
+      <w:pPr>
+        <w:spacing w:before="180" w:after="80" w:line="264" w:lineRule="auto"/>
+      </w:pPr>
+      <w:r>
+        <w:rPr>
+          <w:rFonts w:ascii="Segoe UI Semibold" w:hAnsi="Segoe UI Semibold" w:eastAsia="微软雅黑"/>
+          <w:b/>
+          <w:i w:val="0"/>
+          <w:sz w:val="23"/>
+        </w:rPr>
+        <w:t>5.4 机制模拟（附录，非数据集结果）</w:t>
+      </w:r>
+    </w:p>
+    <w:p>
+      <w:pPr>
+        <w:spacing w:before="0" w:after="80" w:line="264" w:lineRule="auto"/>
+      </w:pPr>
+      <w:r>
+        <w:rPr>
+          <w:rFonts w:ascii="Segoe UI" w:hAnsi="Segoe UI" w:eastAsia="宋体"/>
+          <w:b w:val="0"/>
+          <w:i w:val="0"/>
+          <w:sz w:val="20"/>
+        </w:rPr>
+        <w:t>在数据未到之前用受控模拟先跑过一遍（</w:t>
+      </w:r>
+      <w:r>
+        <w:rPr>
+          <w:rFonts w:ascii="Consolas" w:hAnsi="Consolas" w:eastAsia="Consolas"/>
+          <w:b w:val="0"/>
+          <w:color w:val="B03030"/>
+          <w:sz w:val="19"/>
+        </w:rPr>
+        <w:t>logs/w2_sim_gap_pilot.json</w:t>
+      </w:r>
+      <w:r>
+        <w:rPr>
+          <w:rFonts w:ascii="Segoe UI" w:hAnsi="Segoe UI" w:eastAsia="宋体"/>
+          <w:b w:val="0"/>
+          <w:i w:val="0"/>
+          <w:sz w:val="20"/>
+        </w:rPr>
+        <w:t>）：结论方向与真实数据一致</w:t>
+      </w:r>
+    </w:p>
+    <w:p>
+      <w:pPr>
+        <w:spacing w:before="0" w:after="80" w:line="264" w:lineRule="auto"/>
+      </w:pPr>
+      <w:r>
+        <w:rPr>
+          <w:rFonts w:ascii="Segoe UI" w:hAnsi="Segoe UI" w:eastAsia="宋体"/>
+          <w:b w:val="0"/>
+          <w:i w:val="0"/>
+          <w:sz w:val="20"/>
+        </w:rPr>
+        <w:t>（压缩 → 多报 → 重校准 → 区间过宽），但</w:t>
+      </w:r>
+      <w:r>
+        <w:rPr>
+          <w:rFonts w:ascii="Segoe UI" w:hAnsi="Segoe UI" w:eastAsia="宋体"/>
+          <w:b/>
+          <w:i w:val="0"/>
+          <w:sz w:val="20"/>
+        </w:rPr>
+        <w:t>幅度不可与 §5.3 混用</w:t>
+      </w:r>
+      <w:r>
+        <w:rPr>
+          <w:rFonts w:ascii="Segoe UI" w:hAnsi="Segoe UI" w:eastAsia="宋体"/>
+          <w:b w:val="0"/>
+          <w:i w:val="0"/>
+          <w:sz w:val="20"/>
+        </w:rPr>
+        <w:t>；模拟的高估已在 W2 报告中说明。</w:t>
       </w:r>
     </w:p>
     <w:p>
@@ -4138,7 +4998,7 @@
           <w:i w:val="0"/>
           <w:sz w:val="20"/>
         </w:rPr>
-        <w:t>测量能力已可信</w:t>
+        <w:t>缺口真实存在</w:t>
       </w:r>
       <w:r>
         <w:rPr>
@@ -4147,7 +5007,7 @@
           <w:i w:val="0"/>
           <w:sz w:val="20"/>
         </w:rPr>
-        <w:t>：环境、锚定、显存上限、数值契约都可复现，另有第三方克隆验证（7 个文件位级一致）。</w:t>
+        <w:t>：在"有用的存储压缩"（5–10%）下，三类中有 2–3 类的二元分歧 ≥2 个百分点，H1 成立。</w:t>
       </w:r>
     </w:p>
     <w:p>
@@ -4171,7 +5031,7 @@
           <w:i w:val="0"/>
           <w:sz w:val="20"/>
         </w:rPr>
-        <w:t>压缩改变报警是系统性现象</w:t>
+        <w:t>分歧是单向的</w:t>
       </w:r>
       <w:r>
         <w:rPr>
@@ -4180,25 +5040,7 @@
           <w:i w:val="0"/>
           <w:sz w:val="20"/>
         </w:rPr>
-        <w:t>，不是个别噪声：整个分数分布右移，因此</w:t>
-      </w:r>
-      <w:r>
-        <w:rPr>
-          <w:rFonts w:ascii="Segoe UI" w:hAnsi="Segoe UI" w:eastAsia="宋体"/>
-          <w:b/>
-          <w:i w:val="0"/>
-          <w:sz w:val="20"/>
-        </w:rPr>
-        <w:t>重校准是必须的</w:t>
-      </w:r>
-      <w:r>
-        <w:rPr>
-          <w:rFonts w:ascii="Segoe UI" w:hAnsi="Segoe UI" w:eastAsia="宋体"/>
-          <w:b w:val="0"/>
-          <w:i w:val="0"/>
-          <w:sz w:val="20"/>
-        </w:rPr>
-        <w:t>，而不是可选项。</w:t>
+        <w:t>：720 条分歧全部为多报、零漏报。机制清楚——压缩抬高最近邻距离。</w:t>
       </w:r>
     </w:p>
     <w:p>
@@ -4222,7 +5064,7 @@
           <w:i w:val="0"/>
           <w:sz w:val="20"/>
         </w:rPr>
-        <w:t>重校准不能完全解决</w:t>
+        <w:t>重校准是必需项，但不是充分项</w:t>
       </w:r>
       <w:r>
         <w:rPr>
@@ -4231,7 +5073,7 @@
           <w:i w:val="0"/>
           <w:sz w:val="20"/>
         </w:rPr>
-        <w:t>：残余 2–19% 的分歧集中在近阈值样本，正是本项目的靶心。</w:t>
+        <w:t>：残余 0–2.5% 集中在近阈值样本，正是本项目的靶心。</w:t>
       </w:r>
     </w:p>
     <w:p>
@@ -4255,7 +5097,7 @@
           <w:i w:val="0"/>
           <w:sz w:val="20"/>
         </w:rPr>
-        <w:t>区间筛查在正确性上成立，在代价上不成立</w:t>
+        <w:t>区间筛查正确性成立</w:t>
       </w:r>
       <w:r>
         <w:rPr>
@@ -4264,7 +5106,25 @@
           <w:i w:val="0"/>
           <w:sz w:val="20"/>
         </w:rPr>
-        <w:t>（当前半径定义下）。这不是实现缺陷（零不一致），而是方法的结构性局限，指向 RQ3 与多级细化。</w:t>
+        <w:t>：本地裁决与整库</w:t>
+      </w:r>
+      <w:r>
+        <w:rPr>
+          <w:rFonts w:ascii="Segoe UI" w:hAnsi="Segoe UI" w:eastAsia="宋体"/>
+          <w:b/>
+          <w:i w:val="0"/>
+          <w:sz w:val="20"/>
+        </w:rPr>
+        <w:t>零不一致</w:t>
+      </w:r>
+      <w:r>
+        <w:rPr>
+          <w:rFonts w:ascii="Segoe UI" w:hAnsi="Segoe UI" w:eastAsia="宋体"/>
+          <w:b w:val="0"/>
+          <w:i w:val="0"/>
+          <w:sz w:val="20"/>
+        </w:rPr>
+        <w:t>（三类别、全部条件下）。</w:t>
       </w:r>
     </w:p>
     <w:p>
@@ -4288,7 +5148,7 @@
           <w:i w:val="0"/>
           <w:sz w:val="20"/>
         </w:rPr>
-        <w:t>小校准集不足以支撑精确误报主张</w:t>
+        <w:t>代价高度依赖类别</w:t>
       </w:r>
       <w:r>
         <w:rPr>
@@ -4297,7 +5157,40 @@
           <w:i w:val="0"/>
           <w:sz w:val="20"/>
         </w:rPr>
-        <w:t>：200 张正常图估 5% 分位，实测 FAR 落在 7.5–10%。</w:t>
+        <w:t>：升级率 8.4%（bottle）/ 59.8%（tile）/ 14.4%（screw）。tile 的代价使"减少整库查询"这一卖点打折，指向 RQ3。</w:t>
+      </w:r>
+    </w:p>
+    <w:p>
+      <w:pPr>
+        <w:spacing w:after="40" w:line="283" w:lineRule="auto"/>
+        <w:ind w:left="425" w:hanging="425"/>
+      </w:pPr>
+      <w:r>
+        <w:rPr>
+          <w:rFonts w:ascii="Segoe UI" w:hAnsi="Segoe UI" w:eastAsia="宋体"/>
+          <w:b w:val="0"/>
+          <w:i w:val="0"/>
+          <w:sz w:val="20"/>
+        </w:rPr>
+        <w:t xml:space="preserve">6. </w:t>
+      </w:r>
+      <w:r>
+        <w:rPr>
+          <w:rFonts w:ascii="Segoe UI" w:hAnsi="Segoe UI" w:eastAsia="宋体"/>
+          <w:b/>
+          <w:i w:val="0"/>
+          <w:sz w:val="20"/>
+        </w:rPr>
+        <w:t>分歧率依赖检测器余量</w:t>
+      </w:r>
+      <w:r>
+        <w:rPr>
+          <w:rFonts w:ascii="Segoe UI" w:hAnsi="Segoe UI" w:eastAsia="宋体"/>
+          <w:b w:val="0"/>
+          <w:i w:val="0"/>
+          <w:sz w:val="20"/>
+        </w:rPr>
+        <w:t>：bottle 在 10%/25% 分歧为 0，不是因为压缩安全，而是其 AUROC=1.0 使决策全部落在"确定报警"。</w:t>
       </w:r>
     </w:p>
     <w:p>
@@ -4340,11 +5233,20 @@
       <w:r>
         <w:rPr>
           <w:rFonts w:ascii="Segoe UI" w:hAnsi="Segoe UI" w:eastAsia="宋体"/>
+          <w:b/>
+          <w:i w:val="0"/>
+          <w:sz w:val="20"/>
+        </w:rPr>
+        <w:t>不能</w:t>
+      </w:r>
+      <w:r>
+        <w:rPr>
+          <w:rFonts w:ascii="Segoe UI" w:hAnsi="Segoe UI" w:eastAsia="宋体"/>
           <w:b w:val="0"/>
           <w:i w:val="0"/>
           <w:sz w:val="20"/>
         </w:rPr>
-        <w:t>不能声称任何 MVTec AD / AD 2 上的分歧率或精度（数据未获批，模拟数字不可替代）。</w:t>
+        <w:t>声称 screw 的复现达标（差 2.3 点，超出容差）。</w:t>
       </w:r>
     </w:p>
     <w:p>
@@ -4355,11 +5257,20 @@
       <w:r>
         <w:rPr>
           <w:rFonts w:ascii="Segoe UI" w:hAnsi="Segoe UI" w:eastAsia="宋体"/>
+          <w:b/>
+          <w:i w:val="0"/>
+          <w:sz w:val="20"/>
+        </w:rPr>
+        <w:t>不能</w:t>
+      </w:r>
+      <w:r>
+        <w:rPr>
+          <w:rFonts w:ascii="Segoe UI" w:hAnsi="Segoe UI" w:eastAsia="宋体"/>
           <w:b w:val="0"/>
           <w:i w:val="0"/>
           <w:sz w:val="20"/>
         </w:rPr>
-        <w:t>不能声称"区间筛查能减少整库查询"——模拟显示在困难区间相反。</w:t>
+        <w:t>用 16-shot 的 screw 结果谈"决策保持"——该条件下召回仅 11.8%，检测器本身太弱。</w:t>
       </w:r>
     </w:p>
     <w:p>
@@ -4370,11 +5281,20 @@
       <w:r>
         <w:rPr>
           <w:rFonts w:ascii="Segoe UI" w:hAnsi="Segoe UI" w:eastAsia="宋体"/>
+          <w:b/>
+          <w:i w:val="0"/>
+          <w:sz w:val="20"/>
+        </w:rPr>
+        <w:t>不能</w:t>
+      </w:r>
+      <w:r>
+        <w:rPr>
+          <w:rFonts w:ascii="Segoe UI" w:hAnsi="Segoe UI" w:eastAsia="宋体"/>
           <w:b w:val="0"/>
           <w:i w:val="0"/>
           <w:sz w:val="20"/>
         </w:rPr>
-        <w:t>不能声称与 R8（符合预测集）、R9（记忆污染）相比有优势：两者度量的是什么，需要真实数据上的同协议对比。</w:t>
+        <w:t>声称低误报：test/good 仅 20–41 张，FAR=0% 与 5% 兼容，置信区间很宽。</w:t>
       </w:r>
     </w:p>
     <w:p>
@@ -4385,11 +5305,44 @@
       <w:r>
         <w:rPr>
           <w:rFonts w:ascii="Segoe UI" w:hAnsi="Segoe UI" w:eastAsia="宋体"/>
+          <w:b/>
+          <w:i w:val="0"/>
+          <w:sz w:val="20"/>
+        </w:rPr>
+        <w:t>不能</w:t>
+      </w:r>
+      <w:r>
+        <w:rPr>
+          <w:rFonts w:ascii="Segoe UI" w:hAnsi="Segoe UI" w:eastAsia="宋体"/>
           <w:b w:val="0"/>
           <w:i w:val="0"/>
           <w:sz w:val="20"/>
         </w:rPr>
-        <w:t>不能声称任何油气现场部署结论（公开制造业图像只是代理数据）。</w:t>
+        <w:t>声称外观变化下的结论（未测 AD 2、未做位移实验）。</w:t>
+      </w:r>
+    </w:p>
+    <w:p>
+      <w:pPr>
+        <w:pStyle w:val="ListBullet"/>
+        <w:spacing w:after="40" w:line="283" w:lineRule="auto"/>
+      </w:pPr>
+      <w:r>
+        <w:rPr>
+          <w:rFonts w:ascii="Segoe UI" w:hAnsi="Segoe UI" w:eastAsia="宋体"/>
+          <w:b/>
+          <w:i w:val="0"/>
+          <w:sz w:val="20"/>
+        </w:rPr>
+        <w:t>不能</w:t>
+      </w:r>
+      <w:r>
+        <w:rPr>
+          <w:rFonts w:ascii="Segoe UI" w:hAnsi="Segoe UI" w:eastAsia="宋体"/>
+          <w:b w:val="0"/>
+          <w:i w:val="0"/>
+          <w:sz w:val="20"/>
+        </w:rPr>
+        <w:t>声称任何油气现场部署结论。</w:t>
       </w:r>
     </w:p>
     <w:p>
@@ -4403,7 +5356,7 @@
           <w:i w:val="0"/>
           <w:sz w:val="26"/>
         </w:rPr>
-        <w:t>8. 风险与退路</w:t>
+        <w:t>8. 风险与下一步</w:t>
       </w:r>
     </w:p>
     <w:tbl>
@@ -4485,7 +5438,7 @@
                 <w:i w:val="0"/>
                 <w:sz w:val="16"/>
               </w:rPr>
-              <w:t>退路</w:t>
+              <w:t>下一步</w:t>
             </w:r>
           </w:p>
         </w:tc>
@@ -4507,7 +5460,7 @@
                 <w:i w:val="0"/>
                 <w:sz w:val="16"/>
               </w:rPr>
-              <w:t>数据不可得</w:t>
+              <w:t>screw 复现未达标</w:t>
             </w:r>
           </w:p>
         </w:tc>
@@ -4527,7 +5480,7 @@
                 <w:i w:val="0"/>
                 <w:sz w:val="16"/>
               </w:rPr>
-              <w:t>已持续两周</w:t>
+              <w:t>−2.3 点</w:t>
             </w:r>
           </w:p>
         </w:tc>
@@ -4547,7 +5500,7 @@
                 <w:i w:val="0"/>
                 <w:sz w:val="16"/>
               </w:rPr>
-              <w:t>请学校/导师名义登记；若长期不可得，改为在可公开获取的工业数据集上做同协议研究，并明确说明替换</w:t>
+              <w:t>实现重加权或改 coreset 10% 精确保留；若仍不达标，作为"简化检测器"的已知代价写入论文</w:t>
             </w:r>
           </w:p>
         </w:tc>
@@ -4569,7 +5522,7 @@
                 <w:i w:val="0"/>
                 <w:sz w:val="16"/>
               </w:rPr>
-              <w:t>新颖性被 R8/R9 覆盖</w:t>
+              <w:t>16-shot 检测器弱</w:t>
             </w:r>
           </w:p>
         </w:tc>
@@ -4589,7 +5542,7 @@
                 <w:i w:val="0"/>
                 <w:sz w:val="16"/>
               </w:rPr>
-              <w:t>需 Gate 5 复查</w:t>
+              <w:t>screw 召回 11.8%</w:t>
             </w:r>
           </w:p>
         </w:tc>
@@ -4609,7 +5562,7 @@
                 <w:i w:val="0"/>
                 <w:sz w:val="16"/>
               </w:rPr>
-              <w:t>差异化已写明：符合预测集 vs 决策一致性；检索正确性 vs 报警一致性</w:t>
+              <w:t>补 1/4/40-shot 与全量参考的决策条件</w:t>
             </w:r>
           </w:p>
         </w:tc>
@@ -4631,7 +5584,7 @@
                 <w:i w:val="0"/>
                 <w:sz w:val="16"/>
               </w:rPr>
-              <w:t>区间过宽导致无收益</w:t>
+              <w:t>单一随机种子</w:t>
             </w:r>
           </w:p>
         </w:tc>
@@ -4651,7 +5604,7 @@
                 <w:i w:val="0"/>
                 <w:sz w:val="16"/>
               </w:rPr>
-              <w:t>模拟已现</w:t>
+              <w:t>仅 seed=0</w:t>
             </w:r>
           </w:p>
         </w:tc>
@@ -4671,7 +5624,7 @@
                 <w:i w:val="0"/>
                 <w:sz w:val="16"/>
               </w:rPr>
-              <w:t>多级细化 / 更紧的半径 / 换用精确树对照；若仍无收益，转为严谨的负结果研究</w:t>
+              <w:t>5 个种子 + 配对 bootstrap 区间</w:t>
             </w:r>
           </w:p>
         </w:tc>
@@ -4693,7 +5646,7 @@
                 <w:i w:val="0"/>
                 <w:sz w:val="16"/>
               </w:rPr>
-              <w:t>编码器内存主导</w:t>
+              <w:t>升级率过高（tile）</w:t>
             </w:r>
           </w:p>
         </w:tc>
@@ -4713,7 +5666,7 @@
                 <w:i w:val="0"/>
                 <w:sz w:val="16"/>
               </w:rPr>
-              <w:t>未测</w:t>
+              <w:t>59.8%</w:t>
             </w:r>
           </w:p>
         </w:tc>
@@ -4733,7 +5686,69 @@
                 <w:i w:val="0"/>
                 <w:sz w:val="16"/>
               </w:rPr>
-              <w:t>报告时分列「编码器常驻」与「库」；必要时改用更小编码器并如实标注</w:t>
+              <w:t>Phase 4：多级细化 / 更紧半径 / 精确树对照</w:t>
+            </w:r>
+          </w:p>
+        </w:tc>
+      </w:tr>
+      <w:tr>
+        <w:tc>
+          <w:tcPr>
+            <w:tcW w:type="dxa" w:w="3326"/>
+          </w:tcPr>
+          <w:p>
+            <w:pPr>
+              <w:spacing w:before="20" w:after="20" w:line="252" w:lineRule="auto"/>
+            </w:pPr>
+            <w:r/>
+            <w:r>
+              <w:rPr>
+                <w:rFonts w:ascii="Segoe UI" w:hAnsi="Segoe UI" w:eastAsia="宋体"/>
+                <w:b w:val="0"/>
+                <w:i w:val="0"/>
+                <w:sz w:val="16"/>
+              </w:rPr>
+              <w:t>位移未测</w:t>
+            </w:r>
+          </w:p>
+        </w:tc>
+        <w:tc>
+          <w:tcPr>
+            <w:tcW w:type="dxa" w:w="3326"/>
+          </w:tcPr>
+          <w:p>
+            <w:pPr>
+              <w:spacing w:before="20" w:after="20" w:line="252" w:lineRule="auto"/>
+            </w:pPr>
+            <w:r/>
+            <w:r>
+              <w:rPr>
+                <w:rFonts w:ascii="Segoe UI" w:hAnsi="Segoe UI" w:eastAsia="宋体"/>
+                <w:b w:val="0"/>
+                <w:i w:val="0"/>
+                <w:sz w:val="16"/>
+              </w:rPr>
+              <w:t>—</w:t>
+            </w:r>
+          </w:p>
+        </w:tc>
+        <w:tc>
+          <w:tcPr>
+            <w:tcW w:type="dxa" w:w="3326"/>
+          </w:tcPr>
+          <w:p>
+            <w:pPr>
+              <w:spacing w:before="20" w:after="20" w:line="252" w:lineRule="auto"/>
+            </w:pPr>
+            <w:r/>
+            <w:r>
+              <w:rPr>
+                <w:rFonts w:ascii="Segoe UI" w:hAnsi="Segoe UI" w:eastAsia="宋体"/>
+                <w:b w:val="0"/>
+                <w:i w:val="0"/>
+                <w:sz w:val="16"/>
+              </w:rPr>
+              <w:t>申请 AD 2 或做受控光照扰动（标注为合成）</w:t>
             </w:r>
           </w:p>
         </w:tc>
@@ -4788,7 +5803,7 @@
           <w:rFonts w:ascii="Consolas" w:hAnsi="Consolas" w:eastAsia="Consolas"/>
           <w:sz w:val="16"/>
         </w:rPr>
-        <w:t>python scripts\run.py list        # 全部任务</w:t>
+        <w:t>python scripts\verify_mvtec.py --root F:\research\data\mvtec_ad `</w:t>
       </w:r>
       <w:r>
         <w:br/>
@@ -4798,7 +5813,7 @@
           <w:rFonts w:ascii="Consolas" w:hAnsi="Consolas" w:eastAsia="Consolas"/>
           <w:sz w:val="16"/>
         </w:rPr>
-        <w:t>python scripts\run.py figures     # 出图（PDF+PNG+manifest，位级可复现）</w:t>
+        <w:t xml:space="preserve">  --archive F:\research\data\_download\mvtec_anomaly_detection.tar.xz `</w:t>
       </w:r>
       <w:r>
         <w:br/>
@@ -4808,7 +5823,7 @@
           <w:rFonts w:ascii="Consolas" w:hAnsi="Consolas" w:eastAsia="Consolas"/>
           <w:sz w:val="16"/>
         </w:rPr>
-        <w:t>python scripts\sim_gap_pilot.py   # 模拟实验（约 50 s）</w:t>
+        <w:t xml:space="preserve">  --expect-sha256 cf4313b13603bec67abb49ca959488f7eedce2a9f7795ec54446c649ac98cd3d</w:t>
       </w:r>
       <w:r>
         <w:br/>
@@ -4818,7 +5833,27 @@
           <w:rFonts w:ascii="Consolas" w:hAnsi="Consolas" w:eastAsia="Consolas"/>
           <w:sz w:val="16"/>
         </w:rPr>
-        <w:t>python scripts\lit_extract.py     # 从 PDF 抽文本（供 grep 核对）</w:t>
+        <w:t>python scripts\pipeline_patchcore.py --categories bottle tile screw --ref-mode all --auroc-only --max-bank 400000</w:t>
+      </w:r>
+      <w:r>
+        <w:br/>
+      </w:r>
+      <w:r>
+        <w:rPr>
+          <w:rFonts w:ascii="Consolas" w:hAnsi="Consolas" w:eastAsia="Consolas"/>
+          <w:sz w:val="16"/>
+        </w:rPr>
+        <w:t>python scripts\pipeline_patchcore.py --categories bottle tile screw --max-bank 20000</w:t>
+      </w:r>
+      <w:r>
+        <w:br/>
+      </w:r>
+      <w:r>
+        <w:rPr>
+          <w:rFonts w:ascii="Consolas" w:hAnsi="Consolas" w:eastAsia="Consolas"/>
+          <w:sz w:val="16"/>
+        </w:rPr>
+        <w:t>python scripts\make_figures_real.py</w:t>
       </w:r>
     </w:p>
     <w:p>
@@ -4913,7 +5948,7 @@
                 <w:i w:val="0"/>
                 <w:sz w:val="16"/>
               </w:rPr>
-              <w:t>环境与实测</w:t>
+              <w:t>数据来源与校验</w:t>
             </w:r>
           </w:p>
         </w:tc>
@@ -4933,7 +5968,25 @@
                 <w:color w:val="B03030"/>
                 <w:sz w:val="15"/>
               </w:rPr>
-              <w:t>week1/environment.md</w:t>
+              <w:t>data/DATASET_PROVENANCE.md</w:t>
+            </w:r>
+            <w:r>
+              <w:rPr>
+                <w:rFonts w:ascii="Segoe UI" w:hAnsi="Segoe UI" w:eastAsia="宋体"/>
+                <w:b w:val="0"/>
+                <w:i w:val="0"/>
+                <w:sz w:val="16"/>
+              </w:rPr>
+              <w:t>、</w:t>
+            </w:r>
+            <w:r>
+              <w:rPr>
+                <w:rFonts w:ascii="Consolas" w:hAnsi="Consolas" w:eastAsia="Consolas"/>
+                <w:b w:val="0"/>
+                <w:color w:val="B03030"/>
+                <w:sz w:val="15"/>
+              </w:rPr>
+              <w:t>logs/mvtec_verify.json</w:t>
             </w:r>
           </w:p>
         </w:tc>
@@ -4955,7 +6008,7 @@
                 <w:i w:val="0"/>
                 <w:sz w:val="16"/>
               </w:rPr>
-              <w:t>第一周证据</w:t>
+              <w:t>复现结果</w:t>
             </w:r>
           </w:p>
         </w:tc>
@@ -4975,7 +6028,91 @@
                 <w:color w:val="B03030"/>
                 <w:sz w:val="15"/>
               </w:rPr>
-              <w:t>week1/W1_EVIDENCE.md</w:t>
+              <w:t>logs/w3_repro.json</w:t>
+            </w:r>
+          </w:p>
+        </w:tc>
+      </w:tr>
+      <w:tr>
+        <w:tc>
+          <w:tcPr>
+            <w:tcW w:type="dxa" w:w="4989"/>
+          </w:tcPr>
+          <w:p>
+            <w:pPr>
+              <w:spacing w:before="20" w:after="20" w:line="252" w:lineRule="auto"/>
+            </w:pPr>
+            <w:r/>
+            <w:r>
+              <w:rPr>
+                <w:rFonts w:ascii="Segoe UI" w:hAnsi="Segoe UI" w:eastAsia="宋体"/>
+                <w:b w:val="0"/>
+                <w:i w:val="0"/>
+                <w:sz w:val="16"/>
+              </w:rPr>
+              <w:t>决策实验结果</w:t>
+            </w:r>
+          </w:p>
+        </w:tc>
+        <w:tc>
+          <w:tcPr>
+            <w:tcW w:type="dxa" w:w="4989"/>
+          </w:tcPr>
+          <w:p>
+            <w:pPr>
+              <w:spacing w:before="20" w:after="20" w:line="252" w:lineRule="auto"/>
+            </w:pPr>
+            <w:r/>
+            <w:r>
+              <w:rPr>
+                <w:rFonts w:ascii="Consolas" w:hAnsi="Consolas" w:eastAsia="Consolas"/>
+                <w:b w:val="0"/>
+                <w:color w:val="B03030"/>
+                <w:sz w:val="15"/>
+              </w:rPr>
+              <w:t>logs/w3_decision_16shot.json</w:t>
+            </w:r>
+          </w:p>
+        </w:tc>
+      </w:tr>
+      <w:tr>
+        <w:tc>
+          <w:tcPr>
+            <w:tcW w:type="dxa" w:w="4989"/>
+          </w:tcPr>
+          <w:p>
+            <w:pPr>
+              <w:spacing w:before="20" w:after="20" w:line="252" w:lineRule="auto"/>
+            </w:pPr>
+            <w:r/>
+            <w:r>
+              <w:rPr>
+                <w:rFonts w:ascii="Segoe UI" w:hAnsi="Segoe UI" w:eastAsia="宋体"/>
+                <w:b w:val="0"/>
+                <w:i w:val="0"/>
+                <w:sz w:val="16"/>
+              </w:rPr>
+              <w:t>图</w:t>
+            </w:r>
+          </w:p>
+        </w:tc>
+        <w:tc>
+          <w:tcPr>
+            <w:tcW w:type="dxa" w:w="4989"/>
+          </w:tcPr>
+          <w:p>
+            <w:pPr>
+              <w:spacing w:before="20" w:after="20" w:line="252" w:lineRule="auto"/>
+            </w:pPr>
+            <w:r/>
+            <w:r>
+              <w:rPr>
+                <w:rFonts w:ascii="Consolas" w:hAnsi="Consolas" w:eastAsia="Consolas"/>
+                <w:b w:val="0"/>
+                <w:color w:val="B03030"/>
+                <w:sz w:val="15"/>
+              </w:rPr>
+              <w:t>reports/figures/figure_5_real_disagreement.*</w:t>
             </w:r>
             <w:r>
               <w:rPr>
@@ -4984,7 +6121,7 @@
                 <w:i w:val="0"/>
                 <w:sz w:val="16"/>
               </w:rPr>
-              <w:t xml:space="preserve">（逐步讲解 </w:t>
+              <w:t>、</w:t>
             </w:r>
             <w:r>
               <w:rPr>
@@ -4993,16 +6130,7 @@
                 <w:color w:val="B03030"/>
                 <w:sz w:val="15"/>
               </w:rPr>
-              <w:t>W1_WALKTHROUGH.pdf</w:t>
-            </w:r>
-            <w:r>
-              <w:rPr>
-                <w:rFonts w:ascii="Segoe UI" w:hAnsi="Segoe UI" w:eastAsia="宋体"/>
-                <w:b w:val="0"/>
-                <w:i w:val="0"/>
-                <w:sz w:val="16"/>
-              </w:rPr>
-              <w:t>）</w:t>
+              <w:t>figure_6_real_tradeoff.*</w:t>
             </w:r>
           </w:p>
         </w:tc>
@@ -5044,7 +6172,7 @@
                 <w:color w:val="B03030"/>
                 <w:sz w:val="15"/>
               </w:rPr>
-              <w:t>week1/W1_WEEKLY_REPORT.pdf</w:t>
+              <w:t>week1/</w:t>
             </w:r>
             <w:r>
               <w:rPr>
@@ -5062,7 +6190,25 @@
                 <w:color w:val="B03030"/>
                 <w:sz w:val="15"/>
               </w:rPr>
-              <w:t>week2/W2_WEEKLY_REPORT.pdf</w:t>
+              <w:t>week2/</w:t>
+            </w:r>
+            <w:r>
+              <w:rPr>
+                <w:rFonts w:ascii="Segoe UI" w:hAnsi="Segoe UI" w:eastAsia="宋体"/>
+                <w:b w:val="0"/>
+                <w:i w:val="0"/>
+                <w:sz w:val="16"/>
+              </w:rPr>
+              <w:t>、</w:t>
+            </w:r>
+            <w:r>
+              <w:rPr>
+                <w:rFonts w:ascii="Consolas" w:hAnsi="Consolas" w:eastAsia="Consolas"/>
+                <w:b w:val="0"/>
+                <w:color w:val="B03030"/>
+                <w:sz w:val="15"/>
+              </w:rPr>
+              <w:t>week3/</w:t>
             </w:r>
           </w:p>
         </w:tc>
@@ -5144,7 +6290,7 @@
                 <w:i w:val="0"/>
                 <w:sz w:val="16"/>
               </w:rPr>
-              <w:t>文献来源与哈希</w:t>
+              <w:t>进度看板</w:t>
             </w:r>
           </w:p>
         </w:tc>
@@ -5164,7 +6310,7 @@
                 <w:color w:val="B03030"/>
                 <w:sz w:val="15"/>
               </w:rPr>
-              <w:t>literature/SOURCES.md</w:t>
+              <w:t>PROGRESS_BOARD.pdf</w:t>
             </w:r>
           </w:p>
         </w:tc>
@@ -5211,108 +6357,6 @@
           </w:p>
         </w:tc>
       </w:tr>
-      <w:tr>
-        <w:tc>
-          <w:tcPr>
-            <w:tcW w:type="dxa" w:w="4989"/>
-          </w:tcPr>
-          <w:p>
-            <w:pPr>
-              <w:spacing w:before="20" w:after="20" w:line="252" w:lineRule="auto"/>
-            </w:pPr>
-            <w:r/>
-            <w:r>
-              <w:rPr>
-                <w:rFonts w:ascii="Segoe UI" w:hAnsi="Segoe UI" w:eastAsia="宋体"/>
-                <w:b w:val="0"/>
-                <w:i w:val="0"/>
-                <w:sz w:val="16"/>
-              </w:rPr>
-              <w:t>模拟结果</w:t>
-            </w:r>
-          </w:p>
-        </w:tc>
-        <w:tc>
-          <w:tcPr>
-            <w:tcW w:type="dxa" w:w="4989"/>
-          </w:tcPr>
-          <w:p>
-            <w:pPr>
-              <w:spacing w:before="20" w:after="20" w:line="252" w:lineRule="auto"/>
-            </w:pPr>
-            <w:r/>
-            <w:r>
-              <w:rPr>
-                <w:rFonts w:ascii="Consolas" w:hAnsi="Consolas" w:eastAsia="Consolas"/>
-                <w:b w:val="0"/>
-                <w:color w:val="B03030"/>
-                <w:sz w:val="15"/>
-              </w:rPr>
-              <w:t>logs/w2_sim_gap_pilot.json</w:t>
-            </w:r>
-            <w:r>
-              <w:rPr>
-                <w:rFonts w:ascii="Segoe UI" w:hAnsi="Segoe UI" w:eastAsia="宋体"/>
-                <w:b w:val="0"/>
-                <w:i w:val="0"/>
-                <w:sz w:val="16"/>
-              </w:rPr>
-              <w:t>、</w:t>
-            </w:r>
-            <w:r>
-              <w:rPr>
-                <w:rFonts w:ascii="Consolas" w:hAnsi="Consolas" w:eastAsia="Consolas"/>
-                <w:b w:val="0"/>
-                <w:color w:val="B03030"/>
-                <w:sz w:val="15"/>
-              </w:rPr>
-              <w:t>reports/figures/figure_4_*.png</w:t>
-            </w:r>
-          </w:p>
-        </w:tc>
-      </w:tr>
-      <w:tr>
-        <w:tc>
-          <w:tcPr>
-            <w:tcW w:type="dxa" w:w="4989"/>
-          </w:tcPr>
-          <w:p>
-            <w:pPr>
-              <w:spacing w:before="20" w:after="20" w:line="252" w:lineRule="auto"/>
-            </w:pPr>
-            <w:r/>
-            <w:r>
-              <w:rPr>
-                <w:rFonts w:ascii="Segoe UI" w:hAnsi="Segoe UI" w:eastAsia="宋体"/>
-                <w:b w:val="0"/>
-                <w:i w:val="0"/>
-                <w:sz w:val="16"/>
-              </w:rPr>
-              <w:t>锚点</w:t>
-            </w:r>
-          </w:p>
-        </w:tc>
-        <w:tc>
-          <w:tcPr>
-            <w:tcW w:type="dxa" w:w="4989"/>
-          </w:tcPr>
-          <w:p>
-            <w:pPr>
-              <w:spacing w:before="20" w:after="20" w:line="252" w:lineRule="auto"/>
-            </w:pPr>
-            <w:r/>
-            <w:r>
-              <w:rPr>
-                <w:rFonts w:ascii="Consolas" w:hAnsi="Consolas" w:eastAsia="Consolas"/>
-                <w:b w:val="0"/>
-                <w:color w:val="B03030"/>
-                <w:sz w:val="15"/>
-              </w:rPr>
-              <w:t>logs/anchors_latest.json</w:t>
-            </w:r>
-          </w:p>
-        </w:tc>
-      </w:tr>
     </w:tbl>
     <w:p>
       <w:pPr>
@@ -5339,25 +6383,7 @@
           <w:i w:val="0"/>
           <w:sz w:val="20"/>
         </w:rPr>
-        <w:t xml:space="preserve">本报告中凡是标注「模拟」的数字，都不得出现在论文的数据表里；凡是引用他人结论处，均已给出来源编号（R1–R11），完整引用见 </w:t>
-      </w:r>
-      <w:r>
-        <w:rPr>
-          <w:rFonts w:ascii="Consolas" w:hAnsi="Consolas" w:eastAsia="Consolas"/>
-          <w:b w:val="0"/>
-          <w:color w:val="B03030"/>
-          <w:sz w:val="19"/>
-        </w:rPr>
-        <w:t>literature/SOURCES.md</w:t>
-      </w:r>
-      <w:r>
-        <w:rPr>
-          <w:rFonts w:ascii="Segoe UI" w:hAnsi="Segoe UI" w:eastAsia="宋体"/>
-          <w:b w:val="0"/>
-          <w:i w:val="0"/>
-          <w:sz w:val="20"/>
-        </w:rPr>
-        <w:t>。</w:t>
+        <w:t>本报告所有数字均可在 §9.1 的命令下重跑得到；模拟结果（§5.4）单独标注，不得与真实数据混用。</w:t>
       </w:r>
     </w:p>
     <w:sectPr>

</xml_diff>